<commit_message>
our last braincell has passed away
added access
made the class diagrams in there
made the bqe
uhhh
</commit_message>
<xml_diff>
--- a/ParkWise/ex1_solution_2026_Acendent.docx
+++ b/ParkWise/ex1_solution_2026_Acendent.docx
@@ -6,35 +6,25 @@
       <w:pPr>
         <w:pStyle w:val="1"/>
         <w:bidi w:val="0"/>
-        <w:spacing w:line="360" w:lineRule="auto"/>
-        <w:jc w:val="both"/>
-        <w:rPr>
-          <w:rFonts w:ascii="Calibri" w:hAnsi="Calibri" w:cs="Calibri"/>
-          <w:sz w:val="36"/>
-          <w:szCs w:val="36"/>
-        </w:rPr>
-      </w:pPr>
-      <w:r>
-        <w:rPr>
-          <w:rFonts w:ascii="Calibri" w:hAnsi="Calibri" w:cs="Calibri"/>
-          <w:sz w:val="36"/>
-          <w:szCs w:val="36"/>
-        </w:rPr>
-        <w:t xml:space="preserve">Design and Implementation </w:t>
-      </w:r>
-      <w:r>
-        <w:rPr>
-          <w:rFonts w:ascii="Calibri" w:hAnsi="Calibri" w:cs="Calibri"/>
-          <w:sz w:val="36"/>
-          <w:szCs w:val="36"/>
-        </w:rPr>
-        <w:t xml:space="preserve">of IS: </w:t>
-      </w:r>
-      <w:r>
-        <w:rPr>
-          <w:rFonts w:ascii="Calibri" w:hAnsi="Calibri" w:cs="Calibri"/>
-          <w:sz w:val="36"/>
-          <w:szCs w:val="36"/>
+        <w:rPr>
+          <w:rFonts w:asciiTheme="minorBidi" w:hAnsiTheme="minorBidi" w:cstheme="minorBidi"/>
+          <w:sz w:val="28"/>
+          <w:szCs w:val="28"/>
+        </w:rPr>
+      </w:pPr>
+      <w:r>
+        <w:rPr>
+          <w:rFonts w:asciiTheme="minorBidi" w:hAnsiTheme="minorBidi" w:cstheme="minorBidi"/>
+          <w:sz w:val="28"/>
+          <w:szCs w:val="28"/>
+        </w:rPr>
+        <w:t xml:space="preserve">Design and Implementation of IS: </w:t>
+      </w:r>
+      <w:r>
+        <w:rPr>
+          <w:rFonts w:asciiTheme="minorBidi" w:hAnsiTheme="minorBidi" w:cstheme="minorBidi"/>
+          <w:sz w:val="28"/>
+          <w:szCs w:val="28"/>
         </w:rPr>
         <w:t xml:space="preserve"> </w:t>
       </w:r>
@@ -43,60 +33,58 @@
       <w:pPr>
         <w:pStyle w:val="1"/>
         <w:bidi w:val="0"/>
-        <w:spacing w:line="360" w:lineRule="auto"/>
-        <w:jc w:val="both"/>
-        <w:rPr>
-          <w:rFonts w:ascii="Calibri" w:hAnsi="Calibri" w:cs="Calibri"/>
-          <w:sz w:val="36"/>
-          <w:szCs w:val="36"/>
-        </w:rPr>
-      </w:pPr>
-      <w:r>
-        <w:rPr>
-          <w:rFonts w:ascii="Calibri" w:hAnsi="Calibri" w:cs="Calibri"/>
-          <w:sz w:val="36"/>
-          <w:szCs w:val="36"/>
-        </w:rPr>
-        <w:t>Assignment</w:t>
-      </w:r>
-      <w:r>
-        <w:rPr>
-          <w:rFonts w:ascii="Calibri" w:hAnsi="Calibri" w:cs="Calibri"/>
-          <w:sz w:val="36"/>
-          <w:szCs w:val="36"/>
-        </w:rPr>
-        <w:t xml:space="preserve"> 1</w:t>
-      </w:r>
-      <w:r>
-        <w:rPr>
-          <w:rFonts w:ascii="Calibri" w:hAnsi="Calibri" w:cs="Calibri"/>
-          <w:sz w:val="36"/>
-          <w:szCs w:val="36"/>
-        </w:rPr>
-        <w:t xml:space="preserve">: </w:t>
-      </w:r>
-      <w:r>
-        <w:rPr>
-          <w:rFonts w:ascii="Calibri" w:hAnsi="Calibri" w:cs="Calibri"/>
-          <w:sz w:val="36"/>
-          <w:szCs w:val="36"/>
+        <w:rPr>
+          <w:rFonts w:asciiTheme="minorBidi" w:hAnsiTheme="minorBidi" w:cstheme="minorBidi"/>
+          <w:sz w:val="28"/>
+          <w:szCs w:val="28"/>
+        </w:rPr>
+      </w:pPr>
+      <w:r>
+        <w:rPr>
+          <w:rFonts w:asciiTheme="minorBidi" w:hAnsiTheme="minorBidi" w:cstheme="minorBidi"/>
+          <w:sz w:val="28"/>
+          <w:szCs w:val="28"/>
+        </w:rPr>
+        <w:t xml:space="preserve">Assignment 1: </w:t>
+      </w:r>
+      <w:r>
+        <w:rPr>
+          <w:rFonts w:asciiTheme="minorBidi" w:hAnsiTheme="minorBidi" w:cstheme="minorBidi"/>
+          <w:sz w:val="28"/>
+          <w:szCs w:val="28"/>
         </w:rPr>
         <w:t>UML</w:t>
       </w:r>
       <w:r>
         <w:rPr>
-          <w:rFonts w:ascii="Calibri" w:hAnsi="Calibri" w:cs="Calibri"/>
-          <w:sz w:val="36"/>
-          <w:szCs w:val="36"/>
-        </w:rPr>
-        <w:t xml:space="preserve"> Use Case and Class Diagrams</w:t>
+          <w:rFonts w:asciiTheme="minorBidi" w:hAnsiTheme="minorBidi" w:cstheme="minorBidi"/>
+          <w:sz w:val="28"/>
+          <w:szCs w:val="28"/>
+        </w:rPr>
+        <w:t xml:space="preserve"> Use</w:t>
+      </w:r>
+      <w:r>
+        <w:rPr>
+          <w:rFonts w:asciiTheme="minorBidi" w:hAnsiTheme="minorBidi" w:cstheme="minorBidi"/>
+          <w:sz w:val="28"/>
+          <w:szCs w:val="28"/>
+        </w:rPr>
+        <w:t xml:space="preserve"> </w:t>
+      </w:r>
+      <w:r>
+        <w:rPr>
+          <w:rFonts w:asciiTheme="minorBidi" w:hAnsiTheme="minorBidi" w:cstheme="minorBidi"/>
+          <w:sz w:val="28"/>
+          <w:szCs w:val="28"/>
+        </w:rPr>
+        <w:t>Case and Class Diagrams</w:t>
       </w:r>
     </w:p>
     <w:p>
       <w:pPr>
         <w:bidi w:val="0"/>
         <w:rPr>
-          <w:rFonts w:ascii="Calibri" w:hAnsi="Calibri" w:cs="Calibri"/>
+          <w:rFonts w:asciiTheme="minorBidi" w:hAnsiTheme="minorBidi" w:cstheme="minorBidi"/>
         </w:rPr>
       </w:pPr>
     </w:p>
@@ -104,46 +92,265 @@
       <w:pPr>
         <w:bidi w:val="0"/>
         <w:rPr>
-          <w:rFonts w:ascii="Calibri" w:eastAsia="Arial" w:hAnsi="Calibri" w:cs="Calibri"/>
+          <w:rFonts w:asciiTheme="minorBidi" w:eastAsia="Arial" w:hAnsiTheme="minorBidi" w:cstheme="minorBidi"/>
         </w:rPr>
       </w:pPr>
     </w:p>
     <w:p>
       <w:pPr>
-        <w:pStyle w:val="HTML"/>
-        <w:rPr>
-          <w:color w:val="000000" w:themeColor="text1"/>
-        </w:rPr>
-      </w:pPr>
-      <w:r>
-        <w:rPr>
-          <w:rFonts w:ascii="Calibri" w:eastAsia="Arial" w:hAnsi="Calibri" w:cs="Calibri"/>
+        <w:bidi w:val="0"/>
+        <w:rPr>
+          <w:rFonts w:asciiTheme="minorBidi" w:eastAsia="Arial" w:hAnsiTheme="minorBidi" w:cstheme="minorBidi"/>
+          <w:bCs/>
+        </w:rPr>
+      </w:pPr>
+      <w:r>
+        <w:rPr>
+          <w:rFonts w:asciiTheme="minorBidi" w:eastAsia="Arial" w:hAnsiTheme="minorBidi" w:cstheme="minorBidi"/>
           <w:b/>
-          <w:color w:val="000000" w:themeColor="text1"/>
-        </w:rPr>
-        <w:t xml:space="preserve">System Name: </w:t>
-      </w:r>
-      <w:proofErr w:type="spellStart"/>
-      <w:r>
-        <w:rPr>
-          <w:color w:val="000000" w:themeColor="text1"/>
-        </w:rPr>
-        <w:t>ParkWise</w:t>
-      </w:r>
-      <w:proofErr w:type="spellEnd"/>
-      <w:r>
-        <w:rPr>
-          <w:color w:val="000000" w:themeColor="text1"/>
-        </w:rPr>
-        <w:t xml:space="preserve"> </w:t>
+        </w:rPr>
+        <w:tab/>
       </w:r>
     </w:p>
     <w:p>
       <w:pPr>
         <w:bidi w:val="0"/>
-        <w:spacing w:line="360" w:lineRule="auto"/>
-        <w:rPr>
-          <w:rFonts w:ascii="Calibri" w:eastAsia="Arial" w:hAnsi="Calibri" w:cs="Calibri"/>
+        <w:rPr>
+          <w:rFonts w:asciiTheme="minorBidi" w:eastAsia="Arial" w:hAnsiTheme="minorBidi" w:cstheme="minorBidi"/>
+          <w:b/>
+        </w:rPr>
+      </w:pPr>
+      <w:r>
+        <w:rPr>
+          <w:rFonts w:asciiTheme="minorBidi" w:eastAsia="Arial" w:hAnsiTheme="minorBidi" w:cstheme="minorBidi"/>
+          <w:b/>
+        </w:rPr>
+        <w:tab/>
+        <w:t xml:space="preserve">   </w:t>
+      </w:r>
+    </w:p>
+    <w:tbl>
+      <w:tblPr>
+        <w:tblStyle w:val="a4"/>
+        <w:tblW w:w="0" w:type="auto"/>
+        <w:tblBorders>
+          <w:top w:val="none" w:sz="0" w:space="0" w:color="auto"/>
+          <w:left w:val="none" w:sz="0" w:space="0" w:color="auto"/>
+          <w:bottom w:val="single" w:sz="4" w:space="0" w:color="FFFFFF" w:themeColor="background1"/>
+          <w:right w:val="none" w:sz="0" w:space="0" w:color="auto"/>
+          <w:insideH w:val="single" w:sz="4" w:space="0" w:color="FFFFFF" w:themeColor="background1"/>
+          <w:insideV w:val="none" w:sz="0" w:space="0" w:color="auto"/>
+        </w:tblBorders>
+        <w:tblLook w:val="04A0" w:firstRow="1" w:lastRow="0" w:firstColumn="1" w:lastColumn="0" w:noHBand="0" w:noVBand="1"/>
+      </w:tblPr>
+      <w:tblGrid>
+        <w:gridCol w:w="2660"/>
+        <w:gridCol w:w="5862"/>
+      </w:tblGrid>
+      <w:tr>
+        <w:tc>
+          <w:tcPr>
+            <w:tcW w:w="2660" w:type="dxa"/>
+          </w:tcPr>
+          <w:p>
+            <w:pPr>
+              <w:bidi w:val="0"/>
+              <w:rPr>
+                <w:rFonts w:asciiTheme="minorBidi" w:eastAsia="Arial" w:hAnsiTheme="minorBidi" w:cstheme="minorBidi"/>
+                <w:b/>
+              </w:rPr>
+            </w:pPr>
+            <w:r>
+              <w:rPr>
+                <w:rFonts w:asciiTheme="minorBidi" w:eastAsia="Arial" w:hAnsiTheme="minorBidi" w:cstheme="minorBidi"/>
+                <w:b/>
+              </w:rPr>
+              <w:t>System Name</w:t>
+            </w:r>
+            <w:r>
+              <w:rPr>
+                <w:rFonts w:asciiTheme="minorBidi" w:eastAsia="Arial" w:hAnsiTheme="minorBidi" w:cstheme="minorBidi"/>
+                <w:b/>
+                <w:color w:val="000000" w:themeColor="text1"/>
+              </w:rPr>
+              <w:t>:</w:t>
+            </w:r>
+          </w:p>
+        </w:tc>
+        <w:tc>
+          <w:tcPr>
+            <w:tcW w:w="5862" w:type="dxa"/>
+          </w:tcPr>
+          <w:p>
+            <w:pPr>
+              <w:pStyle w:val="HTML"/>
+              <w:rPr>
+                <w:rFonts w:asciiTheme="minorBidi" w:hAnsiTheme="minorBidi" w:cstheme="minorBidi"/>
+                <w:color w:val="000000" w:themeColor="text1"/>
+              </w:rPr>
+            </w:pPr>
+            <w:r>
+              <w:rPr>
+                <w:rFonts w:asciiTheme="minorBidi" w:hAnsiTheme="minorBidi" w:cstheme="minorBidi"/>
+                <w:color w:val="000000" w:themeColor="text1"/>
+              </w:rPr>
+              <w:t xml:space="preserve">ParkWise </w:t>
+            </w:r>
+          </w:p>
+        </w:tc>
+      </w:tr>
+      <w:tr>
+        <w:tc>
+          <w:tcPr>
+            <w:tcW w:w="2660" w:type="dxa"/>
+          </w:tcPr>
+          <w:p>
+            <w:pPr>
+              <w:bidi w:val="0"/>
+              <w:rPr>
+                <w:rFonts w:asciiTheme="minorBidi" w:eastAsia="Arial" w:hAnsiTheme="minorBidi" w:cstheme="minorBidi"/>
+                <w:b/>
+              </w:rPr>
+            </w:pPr>
+            <w:r>
+              <w:rPr>
+                <w:rFonts w:asciiTheme="minorBidi" w:eastAsia="Arial" w:hAnsiTheme="minorBidi" w:cstheme="minorBidi"/>
+                <w:b/>
+              </w:rPr>
+              <w:t>Semester</w:t>
+            </w:r>
+            <w:r>
+              <w:rPr>
+                <w:rFonts w:asciiTheme="minorBidi" w:eastAsia="Arial" w:hAnsiTheme="minorBidi" w:cstheme="minorBidi"/>
+                <w:b/>
+              </w:rPr>
+              <w:t>:</w:t>
+            </w:r>
+          </w:p>
+        </w:tc>
+        <w:tc>
+          <w:tcPr>
+            <w:tcW w:w="5862" w:type="dxa"/>
+          </w:tcPr>
+          <w:p>
+            <w:pPr>
+              <w:bidi w:val="0"/>
+              <w:rPr>
+                <w:rFonts w:asciiTheme="minorBidi" w:eastAsia="Arial" w:hAnsiTheme="minorBidi" w:cstheme="minorBidi"/>
+                <w:b/>
+              </w:rPr>
+            </w:pPr>
+            <w:r>
+              <w:rPr>
+                <w:rFonts w:asciiTheme="minorBidi" w:eastAsia="Arial" w:hAnsiTheme="minorBidi" w:cstheme="minorBidi"/>
+                <w:bCs/>
+              </w:rPr>
+              <w:t>a 2026</w:t>
+            </w:r>
+          </w:p>
+        </w:tc>
+      </w:tr>
+      <w:tr>
+        <w:tc>
+          <w:tcPr>
+            <w:tcW w:w="2660" w:type="dxa"/>
+          </w:tcPr>
+          <w:p>
+            <w:pPr>
+              <w:bidi w:val="0"/>
+              <w:rPr>
+                <w:rFonts w:asciiTheme="minorBidi" w:eastAsia="Arial" w:hAnsiTheme="minorBidi" w:cstheme="minorBidi"/>
+                <w:b/>
+              </w:rPr>
+            </w:pPr>
+            <w:r>
+              <w:rPr>
+                <w:rFonts w:asciiTheme="minorBidi" w:eastAsia="Arial" w:hAnsiTheme="minorBidi" w:cstheme="minorBidi"/>
+                <w:b/>
+              </w:rPr>
+              <w:t>Submitted by Group:</w:t>
+            </w:r>
+          </w:p>
+        </w:tc>
+        <w:tc>
+          <w:tcPr>
+            <w:tcW w:w="5862" w:type="dxa"/>
+          </w:tcPr>
+          <w:p>
+            <w:pPr>
+              <w:bidi w:val="0"/>
+              <w:rPr>
+                <w:rFonts w:asciiTheme="minorBidi" w:eastAsia="Arial" w:hAnsiTheme="minorBidi" w:cstheme="minorBidi"/>
+              </w:rPr>
+            </w:pPr>
+            <w:r>
+              <w:rPr>
+                <w:rFonts w:asciiTheme="minorBidi" w:eastAsia="Arial" w:hAnsiTheme="minorBidi" w:cstheme="minorBidi"/>
+                <w:bCs/>
+              </w:rPr>
+              <w:t>Acendent</w:t>
+            </w:r>
+          </w:p>
+        </w:tc>
+      </w:tr>
+      <w:tr>
+        <w:tc>
+          <w:tcPr>
+            <w:tcW w:w="2660" w:type="dxa"/>
+          </w:tcPr>
+          <w:p>
+            <w:pPr>
+              <w:bidi w:val="0"/>
+              <w:rPr>
+                <w:rFonts w:asciiTheme="minorBidi" w:eastAsia="Arial" w:hAnsiTheme="minorBidi" w:cstheme="minorBidi"/>
+                <w:b/>
+              </w:rPr>
+            </w:pPr>
+            <w:r>
+              <w:rPr>
+                <w:rFonts w:asciiTheme="minorBidi" w:eastAsia="Arial" w:hAnsiTheme="minorBidi" w:cstheme="minorBidi"/>
+                <w:b/>
+              </w:rPr>
+              <w:t>Assigned LLM:</w:t>
+            </w:r>
+          </w:p>
+        </w:tc>
+        <w:tc>
+          <w:tcPr>
+            <w:tcW w:w="5862" w:type="dxa"/>
+          </w:tcPr>
+          <w:p>
+            <w:pPr>
+              <w:bidi w:val="0"/>
+              <w:rPr>
+                <w:rFonts w:asciiTheme="minorBidi" w:eastAsia="Arial" w:hAnsiTheme="minorBidi" w:cstheme="minorBidi"/>
+                <w:b/>
+              </w:rPr>
+            </w:pPr>
+            <w:r>
+              <w:rPr>
+                <w:rFonts w:asciiTheme="minorBidi" w:eastAsia="Arial" w:hAnsiTheme="minorBidi" w:cstheme="minorBidi"/>
+                <w:bCs/>
+              </w:rPr>
+              <w:t>G</w:t>
+            </w:r>
+            <w:r>
+              <w:rPr>
+                <w:rFonts w:asciiTheme="minorBidi" w:eastAsia="Arial" w:hAnsiTheme="minorBidi" w:cstheme="minorBidi"/>
+                <w:bCs/>
+                <w:noProof/>
+              </w:rPr>
+              <w:t>imini</w:t>
+            </w:r>
+          </w:p>
+        </w:tc>
+      </w:tr>
+    </w:tbl>
+    <w:p>
+      <w:pPr>
+        <w:bidi w:val="0"/>
+        <w:rPr>
+          <w:rFonts w:asciiTheme="minorBidi" w:eastAsia="Arial" w:hAnsiTheme="minorBidi" w:cstheme="minorBidi"/>
           <w:b/>
         </w:rPr>
       </w:pPr>
@@ -151,173 +358,20 @@
     <w:p>
       <w:pPr>
         <w:bidi w:val="0"/>
-        <w:spacing w:line="360" w:lineRule="auto"/>
-        <w:rPr>
-          <w:rFonts w:ascii="Calibri" w:eastAsia="Arial" w:hAnsi="Calibri" w:cs="Calibri"/>
-          <w:bCs/>
-        </w:rPr>
-      </w:pPr>
-      <w:r>
-        <w:rPr>
-          <w:rFonts w:ascii="Calibri" w:eastAsia="Arial" w:hAnsi="Calibri" w:cs="Calibri"/>
+        <w:rPr>
+          <w:rFonts w:asciiTheme="minorBidi" w:eastAsia="Arial" w:hAnsiTheme="minorBidi" w:cstheme="minorBidi"/>
+        </w:rPr>
+      </w:pPr>
+      <w:r>
+        <w:rPr>
+          <w:rFonts w:asciiTheme="minorBidi" w:eastAsia="Arial" w:hAnsiTheme="minorBidi" w:cstheme="minorBidi"/>
           <w:b/>
         </w:rPr>
-        <w:t>Semester:</w:t>
-      </w:r>
-      <w:r>
-        <w:rPr>
-          <w:rFonts w:ascii="Calibri" w:eastAsia="Arial" w:hAnsi="Calibri" w:cs="Calibri"/>
-          <w:b/>
-        </w:rPr>
-        <w:tab/>
-      </w:r>
-      <w:r>
-        <w:rPr>
-          <w:rFonts w:ascii="Calibri" w:eastAsia="Arial" w:hAnsi="Calibri" w:cs="Calibri"/>
-          <w:bCs/>
-        </w:rPr>
-        <w:t>a</w:t>
-      </w:r>
-    </w:p>
-    <w:p>
-      <w:pPr>
-        <w:bidi w:val="0"/>
-        <w:spacing w:line="360" w:lineRule="auto"/>
-        <w:rPr>
-          <w:rFonts w:ascii="Calibri" w:eastAsia="Arial" w:hAnsi="Calibri" w:cs="Calibri"/>
-        </w:rPr>
-      </w:pPr>
-      <w:r>
-        <w:rPr>
-          <w:rFonts w:ascii="Calibri" w:eastAsia="Arial" w:hAnsi="Calibri" w:cs="Calibri"/>
-          <w:b/>
-        </w:rPr>
-        <w:t>Submitted by</w:t>
-      </w:r>
-      <w:r>
-        <w:rPr>
-          <w:rFonts w:ascii="Calibri" w:eastAsia="Arial" w:hAnsi="Calibri" w:cs="Calibri"/>
-          <w:b/>
-        </w:rPr>
-        <w:t xml:space="preserve"> Group</w:t>
-      </w:r>
-      <w:r>
-        <w:rPr>
-          <w:rFonts w:ascii="Calibri" w:eastAsia="Arial" w:hAnsi="Calibri" w:cs="Calibri"/>
-          <w:b/>
-        </w:rPr>
-        <w:t>:</w:t>
-      </w:r>
-      <w:r>
-        <w:rPr>
-          <w:rFonts w:ascii="Calibri" w:eastAsia="Arial" w:hAnsi="Calibri" w:cs="Calibri"/>
-          <w:b/>
-        </w:rPr>
-        <w:t xml:space="preserve"> </w:t>
-      </w:r>
-      <w:proofErr w:type="spellStart"/>
-      <w:r>
-        <w:rPr>
-          <w:rFonts w:ascii="Calibri" w:eastAsia="Arial" w:hAnsi="Calibri" w:cs="Calibri"/>
-          <w:bCs/>
-        </w:rPr>
-        <w:t>Acendent</w:t>
-      </w:r>
-      <w:proofErr w:type="spellEnd"/>
-    </w:p>
-    <w:p>
-      <w:pPr>
-        <w:bidi w:val="0"/>
-        <w:spacing w:line="360" w:lineRule="auto"/>
-        <w:rPr>
-          <w:rFonts w:ascii="Calibri" w:eastAsia="Arial" w:hAnsi="Calibri" w:cs="Calibri"/>
-          <w:b/>
-        </w:rPr>
-      </w:pPr>
-      <w:r>
-        <w:rPr>
-          <w:rFonts w:ascii="Calibri" w:eastAsia="Arial" w:hAnsi="Calibri" w:cs="Calibri"/>
-          <w:b/>
-        </w:rPr>
-        <w:t>Assigned LLM</w:t>
-      </w:r>
-      <w:r>
-        <w:rPr>
-          <w:rFonts w:ascii="Calibri" w:eastAsia="Arial" w:hAnsi="Calibri" w:cs="Calibri"/>
-          <w:b/>
-        </w:rPr>
-        <w:t>:</w:t>
-      </w:r>
-      <w:r>
-        <w:rPr>
-          <w:rFonts w:ascii="Calibri" w:eastAsia="Arial" w:hAnsi="Calibri" w:cs="Calibri"/>
-          <w:b/>
-        </w:rPr>
-        <w:tab/>
-        <w:t xml:space="preserve">   </w:t>
-      </w:r>
-      <w:proofErr w:type="spellStart"/>
-      <w:r>
-        <w:rPr>
-          <w:rFonts w:ascii="Calibri" w:eastAsia="Arial" w:hAnsi="Calibri" w:cs="Calibri"/>
-          <w:bCs/>
-        </w:rPr>
-        <w:t>G</w:t>
-      </w:r>
-      <w:r>
-        <w:rPr>
-          <w:rFonts w:ascii="Calibri" w:eastAsia="Arial" w:hAnsi="Calibri" w:cs="Calibri"/>
-          <w:bCs/>
-          <w:noProof/>
-        </w:rPr>
-        <w:t>imini</w:t>
-      </w:r>
-      <w:proofErr w:type="spellEnd"/>
-    </w:p>
-    <w:p>
-      <w:pPr>
-        <w:bidi w:val="0"/>
-        <w:spacing w:line="360" w:lineRule="auto"/>
-        <w:rPr>
-          <w:rFonts w:ascii="Calibri" w:eastAsia="Arial" w:hAnsi="Calibri" w:cs="Calibri"/>
-          <w:b/>
-        </w:rPr>
-      </w:pPr>
-    </w:p>
-    <w:p>
-      <w:pPr>
-        <w:bidi w:val="0"/>
-        <w:spacing w:line="360" w:lineRule="auto"/>
-        <w:rPr>
-          <w:rFonts w:ascii="Calibri" w:eastAsia="Arial" w:hAnsi="Calibri" w:cs="Calibri"/>
-        </w:rPr>
-      </w:pPr>
-      <w:r>
-        <w:rPr>
-          <w:rFonts w:ascii="Calibri" w:eastAsia="Arial" w:hAnsi="Calibri" w:cs="Calibri"/>
-          <w:b/>
-        </w:rPr>
-        <w:t xml:space="preserve">Link to the conversation with the LLM (in addition to the </w:t>
-      </w:r>
-      <w:proofErr w:type="spellStart"/>
-      <w:r>
-        <w:rPr>
-          <w:rFonts w:ascii="Calibri" w:eastAsia="Arial" w:hAnsi="Calibri" w:cs="Calibri"/>
-          <w:b/>
-        </w:rPr>
-        <w:t>csv</w:t>
-      </w:r>
-      <w:proofErr w:type="spellEnd"/>
-      <w:r>
-        <w:rPr>
-          <w:rFonts w:ascii="Calibri" w:eastAsia="Arial" w:hAnsi="Calibri" w:cs="Calibri"/>
-          <w:b/>
-        </w:rPr>
-        <w:t xml:space="preserve"> file uploaded to Moodle) </w:t>
-      </w:r>
-      <w:r>
-        <w:rPr>
-          <w:rFonts w:ascii="Calibri" w:eastAsia="Arial" w:hAnsi="Calibri" w:cs="Calibri"/>
+        <w:t xml:space="preserve">Link to the conversation with the LLM (in addition to the csv file uploaded to Moodle) </w:t>
+      </w:r>
+      <w:r>
+        <w:rPr>
+          <w:rFonts w:asciiTheme="minorBidi" w:eastAsia="Arial" w:hAnsiTheme="minorBidi" w:cstheme="minorBidi"/>
           <w:noProof/>
         </w:rPr>
         <w:drawing>
@@ -373,9 +427,8 @@
     <w:p>
       <w:pPr>
         <w:bidi w:val="0"/>
-        <w:spacing w:line="360" w:lineRule="auto"/>
-        <w:rPr>
-          <w:rFonts w:ascii="Calibri" w:hAnsi="Calibri" w:cs="Calibri"/>
+        <w:rPr>
+          <w:rFonts w:asciiTheme="minorBidi" w:hAnsiTheme="minorBidi" w:cstheme="minorBidi"/>
         </w:rPr>
       </w:pPr>
     </w:p>
@@ -384,153 +437,272 @@
         <w:pStyle w:val="1"/>
         <w:bidi w:val="0"/>
         <w:rPr>
-          <w:rFonts w:ascii="Calibri" w:hAnsi="Calibri" w:cs="Calibri"/>
-        </w:rPr>
-      </w:pPr>
-      <w:r>
-        <w:rPr>
-          <w:rFonts w:ascii="Calibri" w:hAnsi="Calibri" w:cs="Calibri"/>
+          <w:rFonts w:asciiTheme="minorBidi" w:hAnsiTheme="minorBidi" w:cstheme="minorBidi"/>
+          <w:sz w:val="28"/>
+          <w:szCs w:val="28"/>
+        </w:rPr>
+      </w:pPr>
+      <w:r>
+        <w:rPr>
+          <w:rFonts w:asciiTheme="minorBidi" w:hAnsiTheme="minorBidi" w:cstheme="minorBidi"/>
+          <w:noProof/>
+          <w:sz w:val="28"/>
+          <w:szCs w:val="28"/>
+        </w:rPr>
+        <w:drawing>
+          <wp:anchor distT="0" distB="0" distL="114300" distR="114300" simplePos="0" relativeHeight="251659264" behindDoc="0" locked="0" layoutInCell="1" allowOverlap="1" wp14:anchorId="172D53C3" wp14:editId="4B5F925E">
+            <wp:simplePos x="0" y="0"/>
+            <wp:positionH relativeFrom="column">
+              <wp:posOffset>-1143000</wp:posOffset>
+            </wp:positionH>
+            <wp:positionV relativeFrom="paragraph">
+              <wp:posOffset>292100</wp:posOffset>
+            </wp:positionV>
+            <wp:extent cx="10103485" cy="5677535"/>
+            <wp:effectExtent l="0" t="0" r="0" b="0"/>
+            <wp:wrapTopAndBottom/>
+            <wp:docPr id="5" name="תמונה 5"/>
+            <wp:cNvGraphicFramePr>
+              <a:graphicFrameLocks xmlns:a="http://schemas.openxmlformats.org/drawingml/2006/main" noChangeAspect="1"/>
+            </wp:cNvGraphicFramePr>
+            <a:graphic xmlns:a="http://schemas.openxmlformats.org/drawingml/2006/main">
+              <a:graphicData uri="http://schemas.openxmlformats.org/drawingml/2006/picture">
+                <pic:pic xmlns:pic="http://schemas.openxmlformats.org/drawingml/2006/picture">
+                  <pic:nvPicPr>
+                    <pic:cNvPr id="0" name="jesus is us.png"/>
+                    <pic:cNvPicPr/>
+                  </pic:nvPicPr>
+                  <pic:blipFill rotWithShape="1">
+                    <a:blip r:embed="rId11">
+                      <a:duotone>
+                        <a:schemeClr val="accent4">
+                          <a:shade val="45000"/>
+                          <a:satMod val="135000"/>
+                        </a:schemeClr>
+                        <a:prstClr val="white"/>
+                      </a:duotone>
+                      <a:extLst>
+                        <a:ext uri="{BEBA8EAE-BF5A-486C-A8C5-ECC9F3942E4B}">
+                          <a14:imgProps xmlns:a14="http://schemas.microsoft.com/office/drawing/2010/main">
+                            <a14:imgLayer r:embed="rId12">
+                              <a14:imgEffect>
+                                <a14:brightnessContrast bright="40000" contrast="-40000"/>
+                              </a14:imgEffect>
+                            </a14:imgLayer>
+                          </a14:imgProps>
+                        </a:ext>
+                        <a:ext uri="{28A0092B-C50C-407E-A947-70E740481C1C}">
+                          <a14:useLocalDpi xmlns:a14="http://schemas.microsoft.com/office/drawing/2010/main" val="0"/>
+                        </a:ext>
+                      </a:extLst>
+                    </a:blip>
+                    <a:srcRect l="15645" t="-2060" r="-12784" b="2060"/>
+                    <a:stretch/>
+                  </pic:blipFill>
+                  <pic:spPr bwMode="auto">
+                    <a:xfrm>
+                      <a:off x="0" y="0"/>
+                      <a:ext cx="10103485" cy="5677535"/>
+                    </a:xfrm>
+                    <a:prstGeom prst="rect">
+                      <a:avLst/>
+                    </a:prstGeom>
+                    <a:ln>
+                      <a:noFill/>
+                    </a:ln>
+                    <a:effectLst>
+                      <a:softEdge rad="112500"/>
+                    </a:effectLst>
+                    <a:extLst>
+                      <a:ext uri="{53640926-AAD7-44D8-BBD7-CCE9431645EC}">
+                        <a14:shadowObscured xmlns:a14="http://schemas.microsoft.com/office/drawing/2010/main"/>
+                      </a:ext>
+                    </a:extLst>
+                  </pic:spPr>
+                </pic:pic>
+              </a:graphicData>
+            </a:graphic>
+            <wp14:sizeRelH relativeFrom="page">
+              <wp14:pctWidth>0</wp14:pctWidth>
+            </wp14:sizeRelH>
+            <wp14:sizeRelV relativeFrom="page">
+              <wp14:pctHeight>0</wp14:pctHeight>
+            </wp14:sizeRelV>
+          </wp:anchor>
+        </w:drawing>
+      </w:r>
+      <w:r>
+        <w:rPr>
+          <w:rFonts w:asciiTheme="minorBidi" w:hAnsiTheme="minorBidi" w:cstheme="minorBidi"/>
+          <w:sz w:val="28"/>
+          <w:szCs w:val="28"/>
         </w:rPr>
         <w:br w:type="page"/>
       </w:r>
       <w:r>
         <w:rPr>
-          <w:rFonts w:ascii="Calibri" w:hAnsi="Calibri" w:cs="Calibri"/>
+          <w:rFonts w:asciiTheme="minorBidi" w:hAnsiTheme="minorBidi" w:cstheme="minorBidi"/>
+          <w:sz w:val="28"/>
+          <w:szCs w:val="28"/>
         </w:rPr>
         <w:lastRenderedPageBreak/>
         <w:t>Assumptions</w:t>
       </w:r>
       <w:r>
         <w:rPr>
-          <w:rFonts w:ascii="Calibri" w:hAnsi="Calibri" w:cs="Calibri"/>
+          <w:rFonts w:asciiTheme="minorBidi" w:hAnsiTheme="minorBidi" w:cstheme="minorBidi"/>
+          <w:sz w:val="28"/>
+          <w:szCs w:val="28"/>
         </w:rPr>
         <w:t>:</w:t>
       </w:r>
     </w:p>
     <w:p>
       <w:pPr>
-        <w:pBdr>
-          <w:top w:val="single" w:sz="4" w:space="1" w:color="auto"/>
-          <w:left w:val="single" w:sz="4" w:space="4" w:color="auto"/>
-          <w:bottom w:val="single" w:sz="4" w:space="1" w:color="auto"/>
-          <w:right w:val="single" w:sz="4" w:space="4" w:color="auto"/>
-        </w:pBdr>
+        <w:pStyle w:val="af"/>
+        <w:numPr>
+          <w:ilvl w:val="0"/>
+          <w:numId w:val="3"/>
+        </w:numPr>
         <w:bidi w:val="0"/>
-        <w:spacing w:line="276" w:lineRule="auto"/>
-        <w:jc w:val="both"/>
-        <w:rPr>
-          <w:rFonts w:ascii="Calibri" w:hAnsi="Calibri" w:cs="Calibri"/>
-        </w:rPr>
-      </w:pPr>
-      <w:r>
-        <w:rPr>
-          <w:rFonts w:ascii="Calibri" w:eastAsia="Arial" w:hAnsi="Calibri" w:cs="Calibri"/>
-        </w:rPr>
-        <w:t>This is an</w:t>
-      </w:r>
-      <w:r>
-        <w:rPr>
-          <w:rFonts w:ascii="Calibri" w:eastAsia="Arial" w:hAnsi="Calibri" w:cs="Calibri"/>
-        </w:rPr>
-        <w:t xml:space="preserve"> optional section for essential assumptions</w:t>
-      </w:r>
-      <w:r>
-        <w:rPr>
-          <w:rFonts w:ascii="Calibri" w:eastAsia="Arial" w:hAnsi="Calibri" w:cs="Calibri"/>
-        </w:rPr>
-        <w:t>;</w:t>
-      </w:r>
-      <w:r>
-        <w:rPr>
-          <w:rFonts w:ascii="Calibri" w:eastAsia="Arial" w:hAnsi="Calibri" w:cs="Calibri"/>
-        </w:rPr>
-        <w:t xml:space="preserve"> </w:t>
-      </w:r>
-      <w:proofErr w:type="gramStart"/>
-      <w:r>
-        <w:rPr>
-          <w:rFonts w:ascii="Calibri" w:eastAsia="Arial" w:hAnsi="Calibri" w:cs="Calibri"/>
-        </w:rPr>
-        <w:t>P</w:t>
-      </w:r>
-      <w:r>
-        <w:rPr>
-          <w:rFonts w:ascii="Calibri" w:eastAsia="Arial" w:hAnsi="Calibri" w:cs="Calibri"/>
-        </w:rPr>
-        <w:t>lease</w:t>
-      </w:r>
-      <w:proofErr w:type="gramEnd"/>
-      <w:r>
-        <w:rPr>
-          <w:rFonts w:ascii="Calibri" w:eastAsia="Arial" w:hAnsi="Calibri" w:cs="Calibri"/>
-        </w:rPr>
-        <w:t xml:space="preserve"> provide concise information aimed at clarifying key aspects for the exercise evaluator</w:t>
-      </w:r>
-      <w:r>
-        <w:rPr>
-          <w:rFonts w:ascii="Calibri" w:eastAsia="Arial" w:hAnsi="Calibri" w:cs="Calibri"/>
-        </w:rPr>
-        <w:t>;</w:t>
-      </w:r>
-      <w:r>
-        <w:rPr>
-          <w:rFonts w:ascii="Calibri" w:eastAsia="Arial" w:hAnsi="Calibri" w:cs="Calibri"/>
-        </w:rPr>
-        <w:t xml:space="preserve"> Ensure that the content does not replicate details already presented in the system description narrative.</w:t>
+        <w:ind w:left="567" w:hanging="425"/>
+        <w:rPr>
+          <w:rFonts w:asciiTheme="minorBidi" w:hAnsiTheme="minorBidi" w:cstheme="minorBidi"/>
+        </w:rPr>
+      </w:pPr>
+      <w:r>
+        <w:rPr>
+          <w:rFonts w:asciiTheme="minorBidi" w:hAnsiTheme="minorBidi" w:cstheme="minorBidi"/>
+        </w:rPr>
+        <w:t xml:space="preserve">Assuming a conveyer is installed in one parking lot and </w:t>
+      </w:r>
+      <w:r>
+        <w:rPr>
+          <w:rFonts w:asciiTheme="minorBidi" w:hAnsiTheme="minorBidi" w:cstheme="minorBidi"/>
+        </w:rPr>
+        <w:t xml:space="preserve">is </w:t>
+      </w:r>
+      <w:r>
+        <w:rPr>
+          <w:rFonts w:asciiTheme="minorBidi" w:hAnsiTheme="minorBidi" w:cstheme="minorBidi"/>
+        </w:rPr>
+        <w:t>not mobile</w:t>
       </w:r>
     </w:p>
     <w:p>
       <w:pPr>
+        <w:pStyle w:val="af"/>
+        <w:numPr>
+          <w:ilvl w:val="0"/>
+          <w:numId w:val="3"/>
+        </w:numPr>
+        <w:bidi w:val="0"/>
+        <w:ind w:left="567" w:hanging="425"/>
+        <w:rPr>
+          <w:rFonts w:asciiTheme="minorBidi" w:hAnsiTheme="minorBidi" w:cstheme="minorBidi"/>
+        </w:rPr>
+      </w:pPr>
+      <w:r>
+        <w:rPr>
+          <w:rFonts w:asciiTheme="minorBidi" w:hAnsiTheme="minorBidi" w:cstheme="minorBidi"/>
+        </w:rPr>
+        <w:t>A</w:t>
+      </w:r>
+      <w:r>
+        <w:rPr>
+          <w:rFonts w:asciiTheme="minorBidi" w:hAnsiTheme="minorBidi" w:cstheme="minorBidi"/>
+        </w:rPr>
+        <w:t xml:space="preserve"> lot will have one sole entrance and exit, hence having one barrier</w:t>
+      </w:r>
+      <w:r>
+        <w:rPr>
+          <w:rFonts w:asciiTheme="minorBidi" w:hAnsiTheme="minorBidi" w:cstheme="minorBidi"/>
+        </w:rPr>
+        <w:t>.</w:t>
+      </w:r>
+    </w:p>
+    <w:p>
+      <w:pPr>
+        <w:pStyle w:val="af"/>
+        <w:numPr>
+          <w:ilvl w:val="0"/>
+          <w:numId w:val="3"/>
+        </w:numPr>
+        <w:bidi w:val="0"/>
+        <w:ind w:left="567" w:hanging="425"/>
+        <w:rPr>
+          <w:rFonts w:asciiTheme="minorBidi" w:hAnsiTheme="minorBidi" w:cstheme="minorBidi"/>
+        </w:rPr>
+      </w:pPr>
+      <w:r>
+        <w:rPr>
+          <w:rFonts w:asciiTheme="minorBidi" w:hAnsiTheme="minorBidi" w:cstheme="minorBidi"/>
+        </w:rPr>
+        <w:t>To get to a certain lot you’d have to go through several conveyers.</w:t>
+      </w:r>
+    </w:p>
+    <w:p>
+      <w:pPr>
+        <w:pStyle w:val="af"/>
+        <w:numPr>
+          <w:ilvl w:val="0"/>
+          <w:numId w:val="3"/>
+        </w:numPr>
+        <w:bidi w:val="0"/>
+        <w:ind w:left="567" w:hanging="425"/>
+        <w:rPr>
+          <w:rFonts w:asciiTheme="minorBidi" w:hAnsiTheme="minorBidi" w:cstheme="minorBidi"/>
+        </w:rPr>
+      </w:pPr>
+      <w:r>
+        <w:rPr>
+          <w:rFonts w:asciiTheme="minorBidi" w:hAnsiTheme="minorBidi" w:cstheme="minorBidi"/>
+        </w:rPr>
+        <w:t>Phone number starts with 0 hence the type of the attribute is “short text”</w:t>
+      </w:r>
+      <w:r>
+        <w:rPr>
+          <w:rFonts w:asciiTheme="minorBidi" w:hAnsiTheme="minorBidi" w:cstheme="minorBidi"/>
+        </w:rPr>
+        <w:t>, same with the vehicle number</w:t>
+      </w:r>
+    </w:p>
+    <w:p>
+      <w:pPr>
         <w:pStyle w:val="1"/>
         <w:bidi w:val="0"/>
         <w:rPr>
-          <w:rFonts w:ascii="Calibri" w:hAnsi="Calibri" w:cs="Calibri"/>
-        </w:rPr>
-      </w:pPr>
-      <w:r>
-        <w:rPr>
-          <w:rFonts w:ascii="Calibri" w:hAnsi="Calibri" w:cs="Calibri"/>
+          <w:rFonts w:asciiTheme="minorBidi" w:hAnsiTheme="minorBidi" w:cstheme="minorBidi"/>
+        </w:rPr>
+      </w:pPr>
+      <w:r>
+        <w:rPr>
+          <w:rFonts w:asciiTheme="minorBidi" w:hAnsiTheme="minorBidi" w:cstheme="minorBidi"/>
         </w:rPr>
         <w:br w:type="page"/>
       </w:r>
       <w:r>
         <w:rPr>
-          <w:rFonts w:ascii="Calibri" w:hAnsi="Calibri" w:cs="Calibri"/>
+          <w:rFonts w:asciiTheme="minorBidi" w:hAnsiTheme="minorBidi" w:cstheme="minorBidi"/>
+          <w:sz w:val="28"/>
+          <w:szCs w:val="28"/>
         </w:rPr>
         <w:lastRenderedPageBreak/>
-        <w:t>1.1</w:t>
-      </w:r>
-      <w:proofErr w:type="gramStart"/>
-      <w:r>
-        <w:rPr>
-          <w:rFonts w:ascii="Calibri" w:hAnsi="Calibri" w:cs="Calibri"/>
-        </w:rPr>
-        <w:t>.</w:t>
-      </w:r>
-      <w:proofErr w:type="spellStart"/>
-      <w:r>
-        <w:rPr>
-          <w:rFonts w:ascii="Calibri" w:hAnsi="Calibri" w:cs="Calibri"/>
-        </w:rPr>
-        <w:t>a</w:t>
-      </w:r>
-      <w:proofErr w:type="spellEnd"/>
-      <w:proofErr w:type="gramEnd"/>
-      <w:r>
-        <w:rPr>
-          <w:rFonts w:ascii="Calibri" w:hAnsi="Calibri" w:cs="Calibri"/>
-        </w:rPr>
-        <w:t xml:space="preserve"> </w:t>
-      </w:r>
-      <w:r>
-        <w:rPr>
-          <w:rFonts w:ascii="Calibri" w:hAnsi="Calibri" w:cs="Calibri"/>
+        <w:t xml:space="preserve">1.1.a </w:t>
+      </w:r>
+      <w:r>
+        <w:rPr>
+          <w:rFonts w:asciiTheme="minorBidi" w:hAnsiTheme="minorBidi" w:cstheme="minorBidi"/>
+          <w:sz w:val="28"/>
+          <w:szCs w:val="28"/>
         </w:rPr>
         <w:t xml:space="preserve">The </w:t>
       </w:r>
       <w:r>
         <w:rPr>
-          <w:rFonts w:ascii="Calibri" w:hAnsi="Calibri" w:cs="Calibri"/>
+          <w:rFonts w:asciiTheme="minorBidi" w:hAnsiTheme="minorBidi" w:cstheme="minorBidi"/>
+          <w:sz w:val="28"/>
+          <w:szCs w:val="28"/>
         </w:rPr>
         <w:t>Use Case Diagram:</w:t>
       </w:r>
@@ -539,14 +711,15 @@
       <w:pPr>
         <w:bidi w:val="0"/>
         <w:rPr>
-          <w:rFonts w:ascii="Calibri" w:eastAsia="Arial" w:hAnsi="Calibri" w:cs="Calibri"/>
+          <w:rFonts w:asciiTheme="minorBidi" w:eastAsia="Arial" w:hAnsiTheme="minorBidi" w:cstheme="minorBidi"/>
         </w:rPr>
       </w:pPr>
     </w:p>
     <w:p>
       <w:pPr>
-        <w:rPr>
-          <w:rFonts w:ascii="Calibri" w:hAnsi="Calibri" w:cs="Calibri"/>
+        <w:bidi w:val="0"/>
+        <w:rPr>
+          <w:rFonts w:asciiTheme="minorBidi" w:hAnsiTheme="minorBidi" w:cstheme="minorBidi"/>
           <w:b/>
           <w:bCs/>
           <w:kern w:val="32"/>
@@ -556,7 +729,7 @@
       </w:pPr>
       <w:r>
         <w:rPr>
-          <w:rFonts w:ascii="Calibri" w:hAnsi="Calibri" w:cs="Calibri"/>
+          <w:rFonts w:asciiTheme="minorBidi" w:hAnsiTheme="minorBidi" w:cstheme="minorBidi"/>
           <w:b/>
           <w:bCs/>
           <w:noProof/>
@@ -565,7 +738,7 @@
           <w:szCs w:val="34"/>
         </w:rPr>
         <w:drawing>
-          <wp:inline distT="0" distB="0" distL="0" distR="0" wp14:anchorId="4D97E29A" wp14:editId="674D029A">
+          <wp:inline distT="0" distB="0" distL="0" distR="0" wp14:anchorId="4D97E29A" wp14:editId="1EC8F204">
             <wp:extent cx="8122635" cy="3959614"/>
             <wp:effectExtent l="5080" t="0" r="0" b="0"/>
             <wp:docPr id="2" name="תמונה 2"/>
@@ -580,7 +753,7 @@
                     <pic:cNvPicPr/>
                   </pic:nvPicPr>
                   <pic:blipFill>
-                    <a:blip r:embed="rId11">
+                    <a:blip r:embed="rId13">
                       <a:extLst>
                         <a:ext uri="{28A0092B-C50C-407E-A947-70E740481C1C}">
                           <a14:useLocalDpi xmlns:a14="http://schemas.microsoft.com/office/drawing/2010/main" val="0"/>
@@ -612,87 +785,89 @@
         <w:pStyle w:val="1"/>
         <w:bidi w:val="0"/>
         <w:rPr>
-          <w:rFonts w:ascii="Calibri" w:hAnsi="Calibri" w:cs="Calibri"/>
-        </w:rPr>
-      </w:pPr>
-      <w:r>
-        <w:rPr>
-          <w:rFonts w:ascii="Calibri" w:hAnsi="Calibri" w:cs="Calibri"/>
+          <w:rFonts w:asciiTheme="minorBidi" w:hAnsiTheme="minorBidi" w:cstheme="minorBidi"/>
+          <w:sz w:val="28"/>
+          <w:szCs w:val="28"/>
+        </w:rPr>
+      </w:pPr>
+      <w:r>
+        <w:rPr>
+          <w:rFonts w:asciiTheme="minorBidi" w:hAnsiTheme="minorBidi" w:cstheme="minorBidi"/>
+          <w:sz w:val="28"/>
+          <w:szCs w:val="28"/>
         </w:rPr>
         <w:lastRenderedPageBreak/>
-        <w:t>1.1</w:t>
-      </w:r>
-      <w:proofErr w:type="gramStart"/>
-      <w:r>
-        <w:rPr>
-          <w:rFonts w:ascii="Calibri" w:hAnsi="Calibri" w:cs="Calibri"/>
-        </w:rPr>
-        <w:t>.b</w:t>
-      </w:r>
-      <w:proofErr w:type="gramEnd"/>
-      <w:r>
-        <w:rPr>
-          <w:rFonts w:ascii="Calibri" w:hAnsi="Calibri" w:cs="Calibri"/>
-        </w:rPr>
-        <w:t xml:space="preserve">. </w:t>
-      </w:r>
-      <w:r>
-        <w:rPr>
-          <w:rFonts w:ascii="Calibri" w:hAnsi="Calibri" w:cs="Calibri"/>
+        <w:t xml:space="preserve">1.1.b. </w:t>
+      </w:r>
+      <w:r>
+        <w:rPr>
+          <w:rFonts w:asciiTheme="minorBidi" w:hAnsiTheme="minorBidi" w:cstheme="minorBidi"/>
+          <w:sz w:val="28"/>
+          <w:szCs w:val="28"/>
         </w:rPr>
         <w:t xml:space="preserve">The </w:t>
       </w:r>
       <w:r>
         <w:rPr>
-          <w:rFonts w:ascii="Calibri" w:hAnsi="Calibri" w:cs="Calibri"/>
+          <w:rFonts w:asciiTheme="minorBidi" w:hAnsiTheme="minorBidi" w:cstheme="minorBidi"/>
+          <w:sz w:val="28"/>
+          <w:szCs w:val="28"/>
         </w:rPr>
         <w:t>Description</w:t>
       </w:r>
       <w:r>
         <w:rPr>
-          <w:rFonts w:ascii="Calibri" w:hAnsi="Calibri" w:cs="Calibri"/>
+          <w:rFonts w:asciiTheme="minorBidi" w:hAnsiTheme="minorBidi" w:cstheme="minorBidi"/>
+          <w:sz w:val="28"/>
+          <w:szCs w:val="28"/>
         </w:rPr>
         <w:t>s</w:t>
       </w:r>
       <w:r>
         <w:rPr>
-          <w:rFonts w:ascii="Calibri" w:hAnsi="Calibri" w:cs="Calibri"/>
+          <w:rFonts w:asciiTheme="minorBidi" w:hAnsiTheme="minorBidi" w:cstheme="minorBidi"/>
+          <w:sz w:val="28"/>
+          <w:szCs w:val="28"/>
         </w:rPr>
         <w:t xml:space="preserve"> of </w:t>
       </w:r>
       <w:r>
         <w:rPr>
-          <w:rFonts w:ascii="Calibri" w:hAnsi="Calibri" w:cs="Calibri"/>
+          <w:rFonts w:asciiTheme="minorBidi" w:hAnsiTheme="minorBidi" w:cstheme="minorBidi"/>
+          <w:sz w:val="28"/>
+          <w:szCs w:val="28"/>
         </w:rPr>
         <w:t xml:space="preserve">the </w:t>
       </w:r>
       <w:r>
         <w:rPr>
-          <w:rFonts w:ascii="Calibri" w:hAnsi="Calibri" w:cs="Calibri"/>
+          <w:rFonts w:asciiTheme="minorBidi" w:hAnsiTheme="minorBidi" w:cstheme="minorBidi"/>
+          <w:sz w:val="28"/>
+          <w:szCs w:val="28"/>
         </w:rPr>
         <w:t>U</w:t>
       </w:r>
       <w:r>
         <w:rPr>
-          <w:rFonts w:ascii="Calibri" w:hAnsi="Calibri" w:cs="Calibri"/>
+          <w:rFonts w:asciiTheme="minorBidi" w:hAnsiTheme="minorBidi" w:cstheme="minorBidi"/>
+          <w:sz w:val="28"/>
+          <w:szCs w:val="28"/>
         </w:rPr>
         <w:t xml:space="preserve">se </w:t>
       </w:r>
       <w:r>
         <w:rPr>
-          <w:rFonts w:ascii="Calibri" w:hAnsi="Calibri" w:cs="Calibri"/>
-        </w:rPr>
-        <w:t>C</w:t>
-      </w:r>
-      <w:r>
-        <w:rPr>
-          <w:rFonts w:ascii="Calibri" w:hAnsi="Calibri" w:cs="Calibri"/>
-        </w:rPr>
-        <w:t>ases</w:t>
-      </w:r>
-      <w:r>
-        <w:rPr>
-          <w:rFonts w:ascii="Calibri" w:hAnsi="Calibri" w:cs="Calibri"/>
+          <w:rFonts w:asciiTheme="minorBidi" w:hAnsiTheme="minorBidi" w:cstheme="minorBidi"/>
+          <w:sz w:val="28"/>
+          <w:szCs w:val="28"/>
+        </w:rPr>
+        <w:t>Cases</w:t>
+      </w:r>
+      <w:r>
+        <w:rPr>
+          <w:rFonts w:asciiTheme="minorBidi" w:hAnsiTheme="minorBidi" w:cstheme="minorBidi"/>
+          <w:sz w:val="28"/>
+          <w:szCs w:val="28"/>
         </w:rPr>
         <w:t>:</w:t>
       </w:r>
@@ -714,26 +889,25 @@
       </w:tblGrid>
       <w:tr>
         <w:trPr>
-          <w:trHeight w:val="794"/>
+          <w:trHeight w:val="737"/>
         </w:trPr>
         <w:tc>
           <w:tcPr>
             <w:tcW w:w="8522" w:type="dxa"/>
-            <w:vAlign w:val="center"/>
           </w:tcPr>
           <w:p>
             <w:pPr>
               <w:pStyle w:val="1"/>
               <w:bidi w:val="0"/>
-              <w:spacing w:line="360" w:lineRule="auto"/>
               <w:ind w:right="-142"/>
               <w:rPr>
                 <w:rFonts w:asciiTheme="minorBidi" w:hAnsiTheme="minorBidi" w:cstheme="minorBidi"/>
+                <w:b w:val="0"/>
+                <w:bCs w:val="0"/>
                 <w:sz w:val="24"/>
                 <w:szCs w:val="24"/>
               </w:rPr>
             </w:pPr>
-            <w:proofErr w:type="gramStart"/>
             <w:r>
               <w:rPr>
                 <w:rFonts w:asciiTheme="minorBidi" w:hAnsiTheme="minorBidi" w:cstheme="minorBidi"/>
@@ -742,24 +916,11 @@
               </w:rPr>
               <w:t>client</w:t>
             </w:r>
-            <w:proofErr w:type="gramEnd"/>
-          </w:p>
-        </w:tc>
-      </w:tr>
-      <w:tr>
-        <w:trPr>
-          <w:trHeight w:val="794"/>
-        </w:trPr>
-        <w:tc>
-          <w:tcPr>
-            <w:tcW w:w="8522" w:type="dxa"/>
-            <w:vAlign w:val="center"/>
-          </w:tcPr>
+          </w:p>
           <w:p>
             <w:pPr>
               <w:pStyle w:val="1"/>
               <w:bidi w:val="0"/>
-              <w:spacing w:line="360" w:lineRule="auto"/>
               <w:ind w:right="-142"/>
               <w:rPr>
                 <w:rFonts w:asciiTheme="minorBidi" w:hAnsiTheme="minorBidi" w:cstheme="minorBidi"/>
@@ -826,7 +987,6 @@
             <w:pPr>
               <w:pStyle w:val="1"/>
               <w:bidi w:val="0"/>
-              <w:spacing w:line="360" w:lineRule="auto"/>
               <w:ind w:right="-142"/>
               <w:rPr>
                 <w:rFonts w:asciiTheme="minorBidi" w:hAnsiTheme="minorBidi" w:cstheme="minorBidi"/>
@@ -851,7 +1011,6 @@
             <w:pPr>
               <w:pStyle w:val="1"/>
               <w:bidi w:val="0"/>
-              <w:spacing w:line="360" w:lineRule="auto"/>
               <w:ind w:right="-142"/>
               <w:rPr>
                 <w:rFonts w:asciiTheme="minorBidi" w:hAnsiTheme="minorBidi" w:cstheme="minorBidi"/>
@@ -940,19 +1099,7 @@
               <w:rPr>
                 <w:rFonts w:asciiTheme="minorBidi" w:hAnsiTheme="minorBidi" w:cstheme="minorBidi"/>
               </w:rPr>
-              <w:t xml:space="preserve">Send </w:t>
-            </w:r>
-            <w:r>
-              <w:rPr>
-                <w:rFonts w:asciiTheme="minorBidi" w:hAnsiTheme="minorBidi" w:cstheme="minorBidi"/>
-              </w:rPr>
-              <w:t xml:space="preserve">parking </w:t>
-            </w:r>
-            <w:r>
-              <w:rPr>
-                <w:rFonts w:asciiTheme="minorBidi" w:hAnsiTheme="minorBidi" w:cstheme="minorBidi"/>
-              </w:rPr>
-              <w:t>SMS to customer</w:t>
+              <w:t>Send parking SMS to customer</w:t>
             </w:r>
           </w:p>
           <w:p>
@@ -976,48 +1123,30 @@
           </w:p>
           <w:p>
             <w:pPr>
-              <w:bidi w:val="0"/>
-              <w:rPr>
-                <w:rFonts w:asciiTheme="minorBidi" w:hAnsiTheme="minorBidi" w:cstheme="minorBidi"/>
-              </w:rPr>
-            </w:pPr>
-          </w:p>
-          <w:p>
-            <w:pPr>
-              <w:bidi w:val="0"/>
-              <w:rPr>
-                <w:rFonts w:asciiTheme="minorBidi" w:hAnsiTheme="minorBidi" w:cstheme="minorBidi"/>
-                <w:b/>
-                <w:bCs/>
-                <w:kern w:val="32"/>
-              </w:rPr>
-            </w:pPr>
-            <w:r>
-              <w:rPr>
-                <w:rFonts w:asciiTheme="minorBidi" w:hAnsiTheme="minorBidi" w:cstheme="minorBidi"/>
-                <w:b/>
-                <w:bCs/>
-                <w:kern w:val="32"/>
-              </w:rPr>
-              <w:t>Administer</w:t>
-            </w:r>
+              <w:pStyle w:val="1"/>
+              <w:bidi w:val="0"/>
+              <w:ind w:right="-142"/>
+              <w:rPr>
+                <w:rFonts w:asciiTheme="minorBidi" w:hAnsiTheme="minorBidi" w:cstheme="minorBidi"/>
+                <w:sz w:val="24"/>
+                <w:szCs w:val="24"/>
+              </w:rPr>
+            </w:pPr>
           </w:p>
         </w:tc>
       </w:tr>
       <w:tr>
         <w:trPr>
-          <w:trHeight w:val="794"/>
+          <w:trHeight w:val="737"/>
         </w:trPr>
         <w:tc>
           <w:tcPr>
             <w:tcW w:w="8522" w:type="dxa"/>
-            <w:vAlign w:val="center"/>
           </w:tcPr>
           <w:p>
             <w:pPr>
               <w:pStyle w:val="1"/>
               <w:bidi w:val="0"/>
-              <w:spacing w:line="360" w:lineRule="auto"/>
               <w:ind w:right="-142"/>
               <w:rPr>
                 <w:rFonts w:asciiTheme="minorBidi" w:hAnsiTheme="minorBidi" w:cstheme="minorBidi"/>
@@ -1030,14 +1159,25 @@
             <w:r>
               <w:rPr>
                 <w:rFonts w:asciiTheme="minorBidi" w:hAnsiTheme="minorBidi" w:cstheme="minorBidi"/>
+                <w:sz w:val="24"/>
+                <w:szCs w:val="24"/>
+              </w:rPr>
+              <w:t>Administer</w:t>
+            </w:r>
+          </w:p>
+          <w:p>
+            <w:pPr>
+              <w:pStyle w:val="1"/>
+              <w:bidi w:val="0"/>
+              <w:ind w:right="-142"/>
+              <w:rPr>
+                <w:rFonts w:asciiTheme="minorBidi" w:hAnsiTheme="minorBidi" w:cstheme="minorBidi"/>
                 <w:b w:val="0"/>
                 <w:bCs w:val="0"/>
                 <w:sz w:val="24"/>
                 <w:szCs w:val="24"/>
               </w:rPr>
-              <w:t xml:space="preserve">Generate annual summary report: generate </w:t>
-            </w:r>
-            <w:proofErr w:type="spellStart"/>
+            </w:pPr>
             <w:r>
               <w:rPr>
                 <w:rFonts w:asciiTheme="minorBidi" w:hAnsiTheme="minorBidi" w:cstheme="minorBidi"/>
@@ -1046,52 +1186,21 @@
                 <w:sz w:val="24"/>
                 <w:szCs w:val="24"/>
               </w:rPr>
-              <w:t>botho</w:t>
-            </w:r>
-            <w:proofErr w:type="spellEnd"/>
-            <w:r>
-              <w:rPr>
-                <w:rFonts w:asciiTheme="minorBidi" w:hAnsiTheme="minorBidi" w:cstheme="minorBidi"/>
-                <w:b w:val="0"/>
-                <w:bCs w:val="0"/>
-                <w:sz w:val="24"/>
-                <w:szCs w:val="24"/>
-              </w:rPr>
-              <w:t xml:space="preserve"> PDF and XML files, include total incomes, some information about the cars and will be ordered by cities</w:t>
-            </w:r>
-          </w:p>
-          <w:p>
-            <w:pPr>
-              <w:bidi w:val="0"/>
-              <w:rPr>
-                <w:rFonts w:asciiTheme="minorBidi" w:hAnsiTheme="minorBidi" w:cstheme="minorBidi"/>
-              </w:rPr>
-            </w:pPr>
-            <w:r>
-              <w:rPr>
-                <w:rFonts w:asciiTheme="minorBidi" w:hAnsiTheme="minorBidi" w:cstheme="minorBidi"/>
-              </w:rPr>
-              <w:t xml:space="preserve">Generate costumed club report- done monthly and reports back the sum of new recruits and the sum of the </w:t>
-            </w:r>
-            <w:proofErr w:type="spellStart"/>
-            <w:r>
-              <w:rPr>
-                <w:rFonts w:asciiTheme="minorBidi" w:hAnsiTheme="minorBidi" w:cstheme="minorBidi"/>
-              </w:rPr>
-              <w:t>over all</w:t>
-            </w:r>
-            <w:proofErr w:type="spellEnd"/>
-            <w:r>
-              <w:rPr>
-                <w:rFonts w:asciiTheme="minorBidi" w:hAnsiTheme="minorBidi" w:cstheme="minorBidi"/>
-              </w:rPr>
-              <w:t xml:space="preserve"> club members</w:t>
-            </w:r>
-            <w:r>
-              <w:rPr>
-                <w:rFonts w:asciiTheme="minorBidi" w:hAnsiTheme="minorBidi" w:cstheme="minorBidi"/>
-              </w:rPr>
-              <w:t>.</w:t>
+              <w:t>Generate annual summary report: generate botho PDF and XML files, include total incomes, some information about the cars and will be ordered by cities</w:t>
+            </w:r>
+          </w:p>
+          <w:p>
+            <w:pPr>
+              <w:bidi w:val="0"/>
+              <w:rPr>
+                <w:rFonts w:asciiTheme="minorBidi" w:hAnsiTheme="minorBidi" w:cstheme="minorBidi"/>
+              </w:rPr>
+            </w:pPr>
+            <w:r>
+              <w:rPr>
+                <w:rFonts w:asciiTheme="minorBidi" w:hAnsiTheme="minorBidi" w:cstheme="minorBidi"/>
+              </w:rPr>
+              <w:t>Generate costumed club report- done monthly and reports back the sum of new recruits and the sum of the over all club members.</w:t>
             </w:r>
           </w:p>
           <w:p>
@@ -1111,29 +1220,23 @@
           <w:p>
             <w:pPr>
               <w:bidi w:val="0"/>
-              <w:rPr>
-                <w:rFonts w:asciiTheme="minorBidi" w:hAnsiTheme="minorBidi" w:cstheme="minorBidi"/>
-              </w:rPr>
-            </w:pPr>
-            <w:r>
               <w:rPr>
                 <w:rFonts w:asciiTheme="minorBidi" w:hAnsiTheme="minorBidi" w:cstheme="minorBidi"/>
                 <w:b/>
                 <w:bCs/>
-              </w:rPr>
-              <w:t>Cc</w:t>
-            </w:r>
+                <w:kern w:val="32"/>
+              </w:rPr>
+            </w:pPr>
           </w:p>
         </w:tc>
       </w:tr>
       <w:tr>
         <w:trPr>
-          <w:trHeight w:val="794"/>
+          <w:trHeight w:val="737"/>
         </w:trPr>
         <w:tc>
           <w:tcPr>
             <w:tcW w:w="8522" w:type="dxa"/>
-            <w:vAlign w:val="center"/>
           </w:tcPr>
           <w:p>
             <w:pPr>
@@ -1145,60 +1248,44 @@
             <w:r>
               <w:rPr>
                 <w:rFonts w:asciiTheme="minorBidi" w:hAnsiTheme="minorBidi" w:cstheme="minorBidi"/>
+                <w:b/>
+                <w:bCs/>
+              </w:rPr>
+              <w:t>C</w:t>
+            </w:r>
+            <w:r>
+              <w:rPr>
+                <w:rFonts w:asciiTheme="minorBidi" w:hAnsiTheme="minorBidi" w:cstheme="minorBidi"/>
+                <w:b/>
+                <w:bCs/>
+              </w:rPr>
+              <w:t>onveyer Controller</w:t>
+            </w:r>
+          </w:p>
+          <w:p>
+            <w:pPr>
+              <w:bidi w:val="0"/>
+              <w:rPr>
+                <w:rFonts w:asciiTheme="minorBidi" w:hAnsiTheme="minorBidi" w:cstheme="minorBidi"/>
+              </w:rPr>
+            </w:pPr>
+            <w:r>
+              <w:rPr>
+                <w:rFonts w:asciiTheme="minorBidi" w:hAnsiTheme="minorBidi" w:cstheme="minorBidi"/>
               </w:rPr>
               <w:t>Decides on the optimal route for the car, while considering its size and weight</w:t>
-            </w:r>
-          </w:p>
-          <w:p>
-            <w:pPr>
-              <w:pStyle w:val="1"/>
-              <w:bidi w:val="0"/>
-              <w:spacing w:line="360" w:lineRule="auto"/>
-              <w:ind w:right="-142"/>
-              <w:rPr>
-                <w:rFonts w:asciiTheme="minorBidi" w:hAnsiTheme="minorBidi" w:cstheme="minorBidi"/>
-                <w:b w:val="0"/>
-                <w:bCs w:val="0"/>
-                <w:sz w:val="24"/>
-                <w:szCs w:val="24"/>
-              </w:rPr>
-            </w:pPr>
-            <w:r>
-              <w:rPr>
-                <w:rFonts w:asciiTheme="minorBidi" w:hAnsiTheme="minorBidi" w:cstheme="minorBidi"/>
-                <w:b w:val="0"/>
-                <w:bCs w:val="0"/>
-                <w:sz w:val="24"/>
-                <w:szCs w:val="24"/>
-              </w:rPr>
-              <w:t>IRS</w:t>
             </w:r>
           </w:p>
         </w:tc>
       </w:tr>
       <w:tr>
         <w:trPr>
-          <w:trHeight w:val="794"/>
+          <w:trHeight w:val="737"/>
         </w:trPr>
         <w:tc>
           <w:tcPr>
             <w:tcW w:w="8522" w:type="dxa"/>
-            <w:vAlign w:val="center"/>
           </w:tcPr>
-          <w:p>
-            <w:pPr>
-              <w:bidi w:val="0"/>
-              <w:rPr>
-                <w:rFonts w:asciiTheme="minorBidi" w:hAnsiTheme="minorBidi" w:cstheme="minorBidi"/>
-              </w:rPr>
-            </w:pPr>
-            <w:r>
-              <w:rPr>
-                <w:rFonts w:asciiTheme="minorBidi" w:hAnsiTheme="minorBidi" w:cstheme="minorBidi"/>
-              </w:rPr>
-              <w:t>Updating price lists</w:t>
-            </w:r>
-          </w:p>
           <w:p>
             <w:pPr>
               <w:bidi w:val="0"/>
@@ -1212,19 +1299,32 @@
                 <w:b/>
                 <w:bCs/>
               </w:rPr>
-              <w:t>GS</w:t>
+              <w:t>IRS</w:t>
+            </w:r>
+          </w:p>
+          <w:p>
+            <w:pPr>
+              <w:bidi w:val="0"/>
+              <w:rPr>
+                <w:rFonts w:asciiTheme="minorBidi" w:hAnsiTheme="minorBidi" w:cstheme="minorBidi"/>
+              </w:rPr>
+            </w:pPr>
+            <w:r>
+              <w:rPr>
+                <w:rFonts w:asciiTheme="minorBidi" w:hAnsiTheme="minorBidi" w:cstheme="minorBidi"/>
+              </w:rPr>
+              <w:t>Updating price lists</w:t>
             </w:r>
           </w:p>
         </w:tc>
       </w:tr>
       <w:tr>
         <w:trPr>
-          <w:trHeight w:val="794"/>
+          <w:trHeight w:val="737"/>
         </w:trPr>
         <w:tc>
           <w:tcPr>
             <w:tcW w:w="8522" w:type="dxa"/>
-            <w:vAlign w:val="center"/>
           </w:tcPr>
           <w:p>
             <w:pPr>
@@ -1234,86 +1334,89 @@
               </w:rPr>
             </w:pPr>
             <w:r>
-              <w:rPr>
-                <w:rFonts w:asciiTheme="minorBidi" w:hAnsiTheme="minorBidi" w:cstheme="minorBidi"/>
-              </w:rPr>
-              <w:t>Detects the vehicles arrival and acts in one of two case: either the vehicle is registers or not, in the former case it opens the barriers, in the latter sends it to registration</w:t>
-            </w:r>
-          </w:p>
-          <w:p>
-            <w:pPr>
-              <w:bidi w:val="0"/>
               <w:rPr>
                 <w:rFonts w:asciiTheme="minorBidi" w:hAnsiTheme="minorBidi" w:cstheme="minorBidi"/>
                 <w:b/>
                 <w:bCs/>
               </w:rPr>
-            </w:pPr>
-            <w:r>
-              <w:rPr>
-                <w:rFonts w:asciiTheme="minorBidi" w:hAnsiTheme="minorBidi" w:cstheme="minorBidi"/>
-                <w:b/>
-                <w:bCs/>
-              </w:rPr>
-              <w:t>PG</w:t>
-            </w:r>
-          </w:p>
-          <w:p>
-            <w:pPr>
-              <w:bidi w:val="0"/>
-              <w:rPr>
-                <w:rFonts w:asciiTheme="minorBidi" w:hAnsiTheme="minorBidi" w:cstheme="minorBidi"/>
-                <w:b/>
-                <w:bCs/>
-              </w:rPr>
-            </w:pPr>
-            <w:r>
-              <w:rPr>
-                <w:rFonts w:asciiTheme="minorBidi" w:hAnsiTheme="minorBidi" w:cstheme="minorBidi"/>
-              </w:rPr>
-              <w:t>Processes payment</w:t>
+              <w:t>Gate Sensor</w:t>
+            </w:r>
+          </w:p>
+          <w:p>
+            <w:pPr>
+              <w:bidi w:val="0"/>
+              <w:rPr>
+                <w:rFonts w:asciiTheme="minorBidi" w:hAnsiTheme="minorBidi" w:cstheme="minorBidi"/>
+              </w:rPr>
+            </w:pPr>
+            <w:r>
+              <w:rPr>
+                <w:rFonts w:asciiTheme="minorBidi" w:hAnsiTheme="minorBidi" w:cstheme="minorBidi"/>
+              </w:rPr>
+              <w:t>Detects the vehicles arrival and acts in one of two case: either the vehicle is registers or not, in the former case it opens the barriers, in the latter sends it to registration</w:t>
             </w:r>
           </w:p>
         </w:tc>
       </w:tr>
       <w:tr>
         <w:trPr>
-          <w:trHeight w:val="794"/>
+          <w:trHeight w:val="737"/>
         </w:trPr>
         <w:tc>
           <w:tcPr>
             <w:tcW w:w="8522" w:type="dxa"/>
-            <w:vAlign w:val="center"/>
           </w:tcPr>
           <w:p>
             <w:pPr>
               <w:bidi w:val="0"/>
-              <w:rPr>
-                <w:rFonts w:asciiTheme="minorBidi" w:hAnsiTheme="minorBidi" w:cstheme="minorBidi"/>
-              </w:rPr>
-            </w:pPr>
-            <w:r>
-              <w:rPr>
-                <w:rFonts w:asciiTheme="minorBidi" w:hAnsiTheme="minorBidi" w:cstheme="minorBidi"/>
-              </w:rPr>
-              <w:t>Decides on the optimal route for the car, while considering its size and weight</w:t>
-            </w:r>
-          </w:p>
-          <w:p>
-            <w:pPr>
-              <w:bidi w:val="0"/>
-              <w:rPr>
-                <w:rFonts w:asciiTheme="minorBidi" w:hAnsiTheme="minorBidi" w:cstheme="minorBidi"/>
-              </w:rPr>
-            </w:pPr>
-            <w:r>
               <w:rPr>
                 <w:rFonts w:asciiTheme="minorBidi" w:hAnsiTheme="minorBidi" w:cstheme="minorBidi"/>
                 <w:b/>
                 <w:bCs/>
               </w:rPr>
-              <w:t>IRS</w:t>
-            </w:r>
+            </w:pPr>
+            <w:r>
+              <w:rPr>
+                <w:rFonts w:asciiTheme="minorBidi" w:hAnsiTheme="minorBidi" w:cstheme="minorBidi"/>
+                <w:b/>
+                <w:bCs/>
+              </w:rPr>
+              <w:t>Payment Getaway</w:t>
+            </w:r>
+          </w:p>
+          <w:p>
+            <w:pPr>
+              <w:bidi w:val="0"/>
+              <w:rPr>
+                <w:rFonts w:asciiTheme="minorBidi" w:hAnsiTheme="minorBidi" w:cstheme="minorBidi"/>
+              </w:rPr>
+            </w:pPr>
+            <w:r>
+              <w:rPr>
+                <w:rFonts w:asciiTheme="minorBidi" w:hAnsiTheme="minorBidi" w:cstheme="minorBidi"/>
+              </w:rPr>
+              <w:t>Processes payment</w:t>
+            </w:r>
+          </w:p>
+        </w:tc>
+      </w:tr>
+      <w:tr>
+        <w:trPr>
+          <w:trHeight w:val="737"/>
+        </w:trPr>
+        <w:tc>
+          <w:tcPr>
+            <w:tcW w:w="8522" w:type="dxa"/>
+          </w:tcPr>
+          <w:p>
+            <w:pPr>
+              <w:bidi w:val="0"/>
+              <w:rPr>
+                <w:rFonts w:asciiTheme="minorBidi" w:hAnsiTheme="minorBidi" w:cstheme="minorBidi"/>
+                <w:b/>
+                <w:bCs/>
+              </w:rPr>
+            </w:pPr>
           </w:p>
         </w:tc>
       </w:tr>
@@ -1322,24 +1425,23 @@
       <w:pPr>
         <w:pStyle w:val="1"/>
         <w:bidi w:val="0"/>
-        <w:spacing w:line="360" w:lineRule="auto"/>
         <w:ind w:right="-142"/>
         <w:rPr>
-          <w:rFonts w:ascii="Calibri" w:hAnsi="Calibri" w:cs="Calibri"/>
-        </w:rPr>
-      </w:pPr>
-      <w:bookmarkStart w:id="0" w:name="_GoBack"/>
-      <w:bookmarkEnd w:id="0"/>
-      <w:r>
-        <w:rPr>
-          <w:rFonts w:ascii="Calibri" w:hAnsi="Calibri" w:cs="Calibri"/>
+          <w:rFonts w:asciiTheme="minorBidi" w:hAnsiTheme="minorBidi" w:cstheme="minorBidi"/>
+        </w:rPr>
+      </w:pPr>
+      <w:r>
+        <w:rPr>
+          <w:rFonts w:asciiTheme="minorBidi" w:hAnsiTheme="minorBidi" w:cstheme="minorBidi"/>
         </w:rPr>
         <w:br w:type="page"/>
       </w:r>
       <w:r>
         <w:rPr>
-          <w:rFonts w:ascii="Calibri" w:hAnsi="Calibri" w:cs="Calibri"/>
+          <w:rFonts w:asciiTheme="minorBidi" w:hAnsiTheme="minorBidi" w:cstheme="minorBidi"/>
           <w:noProof/>
+          <w:sz w:val="28"/>
+          <w:szCs w:val="28"/>
         </w:rPr>
         <w:lastRenderedPageBreak/>
         <w:drawing>
@@ -1366,7 +1468,7 @@
                     <pic:cNvPicPr/>
                   </pic:nvPicPr>
                   <pic:blipFill>
-                    <a:blip r:embed="rId12">
+                    <a:blip r:embed="rId14">
                       <a:extLst>
                         <a:ext uri="{28A0092B-C50C-407E-A947-70E740481C1C}">
                           <a14:useLocalDpi xmlns:a14="http://schemas.microsoft.com/office/drawing/2010/main" val="0"/>
@@ -1400,59 +1502,58 @@
       </w:r>
       <w:r>
         <w:rPr>
-          <w:rFonts w:ascii="Calibri" w:hAnsi="Calibri" w:cs="Calibri"/>
-        </w:rPr>
-        <w:t>1.1</w:t>
-      </w:r>
-      <w:proofErr w:type="gramStart"/>
-      <w:r>
-        <w:rPr>
-          <w:rFonts w:ascii="Calibri" w:hAnsi="Calibri" w:cs="Calibri"/>
-        </w:rPr>
-        <w:t>.c</w:t>
-      </w:r>
-      <w:proofErr w:type="gramEnd"/>
-      <w:r>
-        <w:rPr>
-          <w:rFonts w:ascii="Calibri" w:hAnsi="Calibri" w:cs="Calibri"/>
-        </w:rPr>
-        <w:t xml:space="preserve">. </w:t>
-      </w:r>
-      <w:r>
-        <w:rPr>
-          <w:rFonts w:ascii="Calibri" w:hAnsi="Calibri" w:cs="Calibri"/>
+          <w:rFonts w:asciiTheme="minorBidi" w:hAnsiTheme="minorBidi" w:cstheme="minorBidi"/>
+          <w:sz w:val="28"/>
+          <w:szCs w:val="28"/>
+        </w:rPr>
+        <w:t xml:space="preserve">1.1.c. </w:t>
+      </w:r>
+      <w:r>
+        <w:rPr>
+          <w:rFonts w:asciiTheme="minorBidi" w:hAnsiTheme="minorBidi" w:cstheme="minorBidi"/>
+          <w:sz w:val="28"/>
+          <w:szCs w:val="28"/>
         </w:rPr>
         <w:t>The</w:t>
       </w:r>
       <w:r>
         <w:rPr>
-          <w:rFonts w:ascii="Calibri" w:hAnsi="Calibri" w:cs="Calibri"/>
+          <w:rFonts w:asciiTheme="minorBidi" w:hAnsiTheme="minorBidi" w:cstheme="minorBidi"/>
+          <w:sz w:val="28"/>
+          <w:szCs w:val="28"/>
         </w:rPr>
         <w:t xml:space="preserve"> UML </w:t>
       </w:r>
       <w:r>
         <w:rPr>
-          <w:rFonts w:ascii="Calibri" w:hAnsi="Calibri" w:cs="Calibri"/>
+          <w:rFonts w:asciiTheme="minorBidi" w:hAnsiTheme="minorBidi" w:cstheme="minorBidi"/>
+          <w:sz w:val="28"/>
+          <w:szCs w:val="28"/>
         </w:rPr>
         <w:t xml:space="preserve">Class </w:t>
       </w:r>
       <w:r>
         <w:rPr>
-          <w:rFonts w:ascii="Calibri" w:hAnsi="Calibri" w:cs="Calibri"/>
+          <w:rFonts w:asciiTheme="minorBidi" w:hAnsiTheme="minorBidi" w:cstheme="minorBidi"/>
+          <w:sz w:val="28"/>
+          <w:szCs w:val="28"/>
         </w:rPr>
         <w:t>Diagram</w:t>
       </w:r>
       <w:r>
         <w:rPr>
-          <w:rFonts w:ascii="Calibri" w:hAnsi="Calibri" w:cs="Calibri"/>
+          <w:rFonts w:asciiTheme="minorBidi" w:hAnsiTheme="minorBidi" w:cstheme="minorBidi"/>
+          <w:sz w:val="28"/>
+          <w:szCs w:val="28"/>
         </w:rPr>
         <w:t>:</w:t>
       </w:r>
     </w:p>
     <w:p>
       <w:pPr>
-        <w:rPr>
-          <w:rFonts w:ascii="Calibri" w:hAnsi="Calibri" w:cs="Calibri"/>
+        <w:bidi w:val="0"/>
+        <w:rPr>
+          <w:rFonts w:asciiTheme="minorBidi" w:hAnsiTheme="minorBidi" w:cstheme="minorBidi"/>
           <w:b/>
           <w:bCs/>
           <w:kern w:val="32"/>
@@ -1462,7 +1563,7 @@
       </w:pPr>
       <w:r>
         <w:rPr>
-          <w:rFonts w:ascii="Calibri" w:hAnsi="Calibri" w:cs="Calibri"/>
+          <w:rFonts w:asciiTheme="minorBidi" w:hAnsiTheme="minorBidi" w:cstheme="minorBidi"/>
         </w:rPr>
         <w:br w:type="page"/>
       </w:r>
@@ -1471,35 +1572,34 @@
       <w:pPr>
         <w:pStyle w:val="1"/>
         <w:bidi w:val="0"/>
-        <w:spacing w:line="360" w:lineRule="auto"/>
-        <w:rPr>
-          <w:rFonts w:ascii="Calibri" w:hAnsi="Calibri" w:cs="Calibri"/>
-        </w:rPr>
-      </w:pPr>
-      <w:r>
-        <w:rPr>
-          <w:rFonts w:ascii="Calibri" w:hAnsi="Calibri" w:cs="Calibri"/>
+        <w:rPr>
+          <w:rFonts w:asciiTheme="minorBidi" w:hAnsiTheme="minorBidi" w:cstheme="minorBidi"/>
+          <w:sz w:val="28"/>
+          <w:szCs w:val="28"/>
+        </w:rPr>
+      </w:pPr>
+      <w:r>
+        <w:rPr>
+          <w:rFonts w:asciiTheme="minorBidi" w:hAnsiTheme="minorBidi" w:cstheme="minorBidi"/>
+          <w:sz w:val="28"/>
+          <w:szCs w:val="28"/>
         </w:rPr>
         <w:lastRenderedPageBreak/>
-        <w:t>1.1</w:t>
-      </w:r>
-      <w:proofErr w:type="gramStart"/>
-      <w:r>
-        <w:rPr>
-          <w:rFonts w:ascii="Calibri" w:hAnsi="Calibri" w:cs="Calibri"/>
-        </w:rPr>
-        <w:t>.</w:t>
-      </w:r>
-      <w:r>
-        <w:rPr>
-          <w:rFonts w:ascii="Calibri" w:hAnsi="Calibri" w:cs="Calibri"/>
+        <w:t>1.1.</w:t>
+      </w:r>
+      <w:r>
+        <w:rPr>
+          <w:rFonts w:asciiTheme="minorBidi" w:hAnsiTheme="minorBidi" w:cstheme="minorBidi"/>
+          <w:sz w:val="28"/>
+          <w:szCs w:val="28"/>
         </w:rPr>
         <w:t>d</w:t>
       </w:r>
-      <w:proofErr w:type="gramEnd"/>
-      <w:r>
-        <w:rPr>
-          <w:rFonts w:ascii="Calibri" w:hAnsi="Calibri" w:cs="Calibri"/>
+      <w:r>
+        <w:rPr>
+          <w:rFonts w:asciiTheme="minorBidi" w:hAnsiTheme="minorBidi" w:cstheme="minorBidi"/>
+          <w:sz w:val="28"/>
+          <w:szCs w:val="28"/>
         </w:rPr>
         <w:t>. The Relational Database:</w:t>
       </w:r>
@@ -1507,49 +1607,56 @@
     <w:p>
       <w:pPr>
         <w:pStyle w:val="2"/>
-      </w:pPr>
-      <w:r>
-        <w:t>1.1</w:t>
-      </w:r>
-      <w:proofErr w:type="gramStart"/>
-      <w:r>
-        <w:t>.d1</w:t>
-      </w:r>
-      <w:proofErr w:type="gramEnd"/>
-      <w:r>
-        <w:t>. The Tables:</w:t>
+        <w:rPr>
+          <w:rFonts w:asciiTheme="minorBidi" w:hAnsiTheme="minorBidi" w:cstheme="minorBidi"/>
+        </w:rPr>
+      </w:pPr>
+      <w:r>
+        <w:rPr>
+          <w:rFonts w:asciiTheme="minorBidi" w:hAnsiTheme="minorBidi" w:cstheme="minorBidi"/>
+        </w:rPr>
+        <w:t>1.1.d1. The Tables:</w:t>
       </w:r>
     </w:p>
     <w:p>
       <w:pPr>
         <w:pStyle w:val="1"/>
         <w:bidi w:val="0"/>
-        <w:spacing w:line="360" w:lineRule="auto"/>
-        <w:rPr>
-          <w:rFonts w:ascii="Calibri" w:hAnsi="Calibri" w:cs="Calibri"/>
-        </w:rPr>
-      </w:pPr>
-      <w:r>
-        <w:rPr>
-          <w:rFonts w:ascii="Calibri" w:hAnsi="Calibri" w:cs="Calibri"/>
+        <w:rPr>
+          <w:rFonts w:asciiTheme="minorBidi" w:hAnsiTheme="minorBidi" w:cstheme="minorBidi"/>
+          <w:sz w:val="28"/>
+          <w:szCs w:val="28"/>
+        </w:rPr>
+      </w:pPr>
+      <w:r>
+        <w:rPr>
+          <w:rFonts w:asciiTheme="minorBidi" w:hAnsiTheme="minorBidi" w:cstheme="minorBidi"/>
+          <w:sz w:val="28"/>
+          <w:szCs w:val="28"/>
         </w:rPr>
         <w:t>The T</w:t>
       </w:r>
       <w:r>
         <w:rPr>
-          <w:rFonts w:ascii="Calibri" w:hAnsi="Calibri" w:cs="Calibri"/>
+          <w:rFonts w:asciiTheme="minorBidi" w:hAnsiTheme="minorBidi" w:cstheme="minorBidi"/>
+          <w:sz w:val="28"/>
+          <w:szCs w:val="28"/>
         </w:rPr>
         <w:t>ables</w:t>
       </w:r>
       <w:r>
         <w:rPr>
-          <w:rFonts w:ascii="Calibri" w:hAnsi="Calibri" w:cs="Calibri"/>
+          <w:rFonts w:asciiTheme="minorBidi" w:hAnsiTheme="minorBidi" w:cstheme="minorBidi"/>
+          <w:sz w:val="28"/>
+          <w:szCs w:val="28"/>
         </w:rPr>
         <w:t xml:space="preserve"> in the Database</w:t>
       </w:r>
       <w:r>
         <w:rPr>
-          <w:rFonts w:ascii="Calibri" w:hAnsi="Calibri" w:cs="Calibri"/>
+          <w:rFonts w:asciiTheme="minorBidi" w:hAnsiTheme="minorBidi" w:cstheme="minorBidi"/>
+          <w:sz w:val="28"/>
+          <w:szCs w:val="28"/>
         </w:rPr>
         <w:t>:</w:t>
       </w:r>
@@ -1565,12 +1672,12 @@
         <w:bidi w:val="0"/>
         <w:spacing w:after="240"/>
         <w:rPr>
-          <w:rFonts w:ascii="Calibri" w:eastAsia="Arial" w:hAnsi="Calibri" w:cs="Calibri"/>
-        </w:rPr>
-      </w:pPr>
-      <w:r>
-        <w:rPr>
-          <w:rFonts w:ascii="Calibri" w:eastAsia="Arial" w:hAnsi="Calibri" w:cs="Calibri"/>
+          <w:rFonts w:asciiTheme="minorBidi" w:eastAsia="Arial" w:hAnsiTheme="minorBidi" w:cstheme="minorBidi"/>
+        </w:rPr>
+      </w:pPr>
+      <w:r>
+        <w:rPr>
+          <w:rFonts w:asciiTheme="minorBidi" w:eastAsia="Arial" w:hAnsiTheme="minorBidi" w:cstheme="minorBidi"/>
         </w:rPr>
         <w:t>Make sure to present the table in the third normal form (3NF) and supply information on primary and foreign keys.</w:t>
       </w:r>
@@ -1579,22 +1686,20 @@
       <w:tblPr>
         <w:tblStyle w:val="aa"/>
         <w:bidiVisual/>
-        <w:tblW w:w="8296" w:type="dxa"/>
+        <w:tblW w:w="8607" w:type="dxa"/>
         <w:jc w:val="right"/>
         <w:tblBorders>
-          <w:top w:val="single" w:sz="4" w:space="0" w:color="000000"/>
-          <w:left w:val="single" w:sz="4" w:space="0" w:color="000000"/>
-          <w:bottom w:val="single" w:sz="4" w:space="0" w:color="000000"/>
-          <w:right w:val="single" w:sz="4" w:space="0" w:color="000000"/>
-          <w:insideH w:val="single" w:sz="4" w:space="0" w:color="000000"/>
-          <w:insideV w:val="single" w:sz="4" w:space="0" w:color="000000"/>
+          <w:top w:val="single" w:sz="4" w:space="0" w:color="FFFFFF" w:themeColor="background1"/>
+          <w:bottom w:val="single" w:sz="4" w:space="0" w:color="FFFFFF" w:themeColor="background1"/>
+          <w:insideH w:val="single" w:sz="4" w:space="0" w:color="632423" w:themeColor="accent2" w:themeShade="80"/>
+          <w:insideV w:val="single" w:sz="4" w:space="0" w:color="632423" w:themeColor="accent2" w:themeShade="80"/>
         </w:tblBorders>
         <w:tblLayout w:type="fixed"/>
         <w:tblLook w:val="0000" w:firstRow="0" w:lastRow="0" w:firstColumn="0" w:lastColumn="0" w:noHBand="0" w:noVBand="0"/>
       </w:tblPr>
       <w:tblGrid>
-        <w:gridCol w:w="6743"/>
-        <w:gridCol w:w="1553"/>
+        <w:gridCol w:w="6763"/>
+        <w:gridCol w:w="1844"/>
       </w:tblGrid>
       <w:tr>
         <w:trPr>
@@ -1602,80 +1707,78 @@
         </w:trPr>
         <w:tc>
           <w:tcPr>
-            <w:tcW w:w="6743" w:type="dxa"/>
+            <w:tcW w:w="6763" w:type="dxa"/>
+            <w:shd w:val="clear" w:color="auto" w:fill="D99594" w:themeFill="accent2" w:themeFillTint="99"/>
           </w:tcPr>
           <w:p>
             <w:pPr>
               <w:bidi w:val="0"/>
-              <w:spacing w:line="360" w:lineRule="auto"/>
-              <w:rPr>
-                <w:rFonts w:ascii="Calibri" w:eastAsia="Arial" w:hAnsi="Calibri" w:cs="Calibri"/>
+              <w:rPr>
+                <w:rFonts w:asciiTheme="minorBidi" w:eastAsia="Arial" w:hAnsiTheme="minorBidi" w:cstheme="minorBidi"/>
                 <w:b/>
               </w:rPr>
             </w:pPr>
             <w:r>
               <w:rPr>
-                <w:rFonts w:ascii="Calibri" w:eastAsia="Arial" w:hAnsi="Calibri" w:cs="Calibri"/>
+                <w:rFonts w:asciiTheme="minorBidi" w:eastAsia="Arial" w:hAnsiTheme="minorBidi" w:cstheme="minorBidi"/>
                 <w:b/>
               </w:rPr>
               <w:t xml:space="preserve">Field list </w:t>
             </w:r>
             <w:r>
               <w:rPr>
-                <w:rFonts w:ascii="Calibri" w:eastAsia="Arial" w:hAnsi="Calibri" w:cs="Calibri"/>
+                <w:rFonts w:asciiTheme="minorBidi" w:eastAsia="Arial" w:hAnsiTheme="minorBidi" w:cstheme="minorBidi"/>
                 <w:bCs/>
               </w:rPr>
               <w:t>(</w:t>
             </w:r>
             <w:r>
               <w:rPr>
-                <w:rFonts w:ascii="Calibri" w:eastAsia="Arial" w:hAnsi="Calibri" w:cs="Calibri"/>
+                <w:rFonts w:asciiTheme="minorBidi" w:eastAsia="Arial" w:hAnsiTheme="minorBidi" w:cstheme="minorBidi"/>
                 <w:bCs/>
               </w:rPr>
               <w:t xml:space="preserve">underline </w:t>
             </w:r>
             <w:r>
               <w:rPr>
-                <w:rFonts w:ascii="Calibri" w:eastAsia="Arial" w:hAnsi="Calibri" w:cs="Calibri"/>
+                <w:rFonts w:asciiTheme="minorBidi" w:eastAsia="Arial" w:hAnsiTheme="minorBidi" w:cstheme="minorBidi"/>
                 <w:bCs/>
               </w:rPr>
               <w:t>primary key</w:t>
             </w:r>
             <w:r>
               <w:rPr>
-                <w:rFonts w:ascii="Calibri" w:eastAsia="Arial" w:hAnsi="Calibri" w:cs="Calibri"/>
+                <w:rFonts w:asciiTheme="minorBidi" w:eastAsia="Arial" w:hAnsiTheme="minorBidi" w:cstheme="minorBidi"/>
                 <w:bCs/>
               </w:rPr>
               <w:t>s; clearly specify</w:t>
             </w:r>
             <w:r>
               <w:rPr>
-                <w:rFonts w:ascii="Calibri" w:eastAsia="Arial" w:hAnsi="Calibri" w:cs="Calibri"/>
+                <w:rFonts w:asciiTheme="minorBidi" w:eastAsia="Arial" w:hAnsiTheme="minorBidi" w:cstheme="minorBidi"/>
                 <w:bCs/>
               </w:rPr>
               <w:t xml:space="preserve"> foreign keys </w:t>
             </w:r>
             <w:r>
               <w:rPr>
-                <w:rFonts w:ascii="Calibri" w:eastAsia="Arial" w:hAnsi="Calibri" w:cs="Calibri"/>
+                <w:rFonts w:asciiTheme="minorBidi" w:eastAsia="Arial" w:hAnsiTheme="minorBidi" w:cstheme="minorBidi"/>
                 <w:bCs/>
               </w:rPr>
               <w:t xml:space="preserve">with the notation of FK </w:t>
             </w:r>
-            <w:proofErr w:type="spellStart"/>
-            <w:r>
-              <w:rPr>
-                <w:rFonts w:ascii="Calibri" w:eastAsia="Arial" w:hAnsi="Calibri" w:cs="Calibri"/>
+            <w:r>
+              <w:rPr>
+                <w:rFonts w:asciiTheme="minorBidi" w:eastAsia="Arial" w:hAnsiTheme="minorBidi" w:cstheme="minorBidi"/>
                 <w:bCs/>
                 <w:i/>
                 <w:iCs/>
               </w:rPr>
               <w:t>table_name</w:t>
             </w:r>
-            <w:proofErr w:type="spellEnd"/>
-            <w:r>
-              <w:rPr>
-                <w:rFonts w:ascii="Calibri" w:eastAsia="Arial" w:hAnsi="Calibri" w:cs="Calibri"/>
+            <w:r>
+              <w:rPr>
+                <w:rFonts w:asciiTheme="minorBidi" w:eastAsia="Arial" w:hAnsiTheme="minorBidi" w:cstheme="minorBidi"/>
                 <w:bCs/>
               </w:rPr>
               <w:t>)</w:t>
@@ -1684,20 +1787,20 @@
         </w:tc>
         <w:tc>
           <w:tcPr>
-            <w:tcW w:w="1553" w:type="dxa"/>
+            <w:tcW w:w="1844" w:type="dxa"/>
+            <w:shd w:val="clear" w:color="auto" w:fill="D99594" w:themeFill="accent2" w:themeFillTint="99"/>
           </w:tcPr>
           <w:p>
             <w:pPr>
               <w:bidi w:val="0"/>
-              <w:spacing w:line="360" w:lineRule="auto"/>
-              <w:rPr>
-                <w:rFonts w:ascii="Calibri" w:eastAsia="Arial" w:hAnsi="Calibri" w:cs="Calibri"/>
+              <w:rPr>
+                <w:rFonts w:asciiTheme="minorBidi" w:eastAsia="Arial" w:hAnsiTheme="minorBidi" w:cstheme="minorBidi"/>
                 <w:b/>
               </w:rPr>
             </w:pPr>
             <w:r>
               <w:rPr>
-                <w:rFonts w:ascii="Calibri" w:eastAsia="Arial" w:hAnsi="Calibri" w:cs="Calibri"/>
+                <w:rFonts w:asciiTheme="minorBidi" w:eastAsia="Arial" w:hAnsiTheme="minorBidi" w:cstheme="minorBidi"/>
                 <w:b/>
               </w:rPr>
               <w:t>Table name</w:t>
@@ -1712,30 +1815,67 @@
         </w:trPr>
         <w:tc>
           <w:tcPr>
-            <w:tcW w:w="6743" w:type="dxa"/>
+            <w:tcW w:w="6763" w:type="dxa"/>
           </w:tcPr>
           <w:p>
             <w:pPr>
               <w:bidi w:val="0"/>
-              <w:spacing w:line="360" w:lineRule="auto"/>
-              <w:rPr>
-                <w:rFonts w:ascii="Calibri" w:hAnsi="Calibri" w:cs="Calibri"/>
-              </w:rPr>
-            </w:pPr>
+              <w:rPr>
+                <w:rFonts w:asciiTheme="minorBidi" w:hAnsiTheme="minorBidi" w:cstheme="minorBidi"/>
+              </w:rPr>
+            </w:pPr>
+            <w:r>
+              <w:rPr>
+                <w:rFonts w:asciiTheme="minorBidi" w:hAnsiTheme="minorBidi" w:cstheme="minorBidi"/>
+                <w:u w:val="single"/>
+              </w:rPr>
+              <w:t>ParkinglotID</w:t>
+            </w:r>
+            <w:r>
+              <w:rPr>
+                <w:rFonts w:asciiTheme="minorBidi" w:hAnsiTheme="minorBidi" w:cstheme="minorBidi"/>
+                <w:u w:val="single"/>
+              </w:rPr>
+              <w:t>,</w:t>
+            </w:r>
+            <w:r>
+              <w:rPr>
+                <w:rFonts w:asciiTheme="minorBidi" w:hAnsiTheme="minorBidi" w:cstheme="minorBidi"/>
+              </w:rPr>
+              <w:t xml:space="preserve">  </w:t>
+            </w:r>
+            <w:r>
+              <w:rPr>
+                <w:rFonts w:asciiTheme="minorBidi" w:hAnsiTheme="minorBidi" w:cstheme="minorBidi"/>
+                <w:u w:val="single"/>
+              </w:rPr>
+              <w:t>l</w:t>
+            </w:r>
+            <w:r>
+              <w:rPr>
+                <w:rFonts w:asciiTheme="minorBidi" w:hAnsiTheme="minorBidi" w:cstheme="minorBidi"/>
+              </w:rPr>
+              <w:t>otName, adresse, city, availableSpaces</w:t>
+            </w:r>
           </w:p>
         </w:tc>
         <w:tc>
           <w:tcPr>
-            <w:tcW w:w="1553" w:type="dxa"/>
+            <w:tcW w:w="1844" w:type="dxa"/>
           </w:tcPr>
           <w:p>
             <w:pPr>
               <w:bidi w:val="0"/>
-              <w:spacing w:line="360" w:lineRule="auto"/>
-              <w:rPr>
-                <w:rFonts w:ascii="Calibri" w:hAnsi="Calibri" w:cs="Calibri"/>
-              </w:rPr>
-            </w:pPr>
+              <w:rPr>
+                <w:rFonts w:asciiTheme="minorBidi" w:hAnsiTheme="minorBidi" w:cstheme="minorBidi"/>
+              </w:rPr>
+            </w:pPr>
+            <w:r>
+              <w:rPr>
+                <w:rFonts w:asciiTheme="minorBidi" w:hAnsiTheme="minorBidi" w:cstheme="minorBidi"/>
+              </w:rPr>
+              <w:t>ParkingLots</w:t>
+            </w:r>
           </w:p>
         </w:tc>
       </w:tr>
@@ -1746,30 +1886,47 @@
         </w:trPr>
         <w:tc>
           <w:tcPr>
-            <w:tcW w:w="6743" w:type="dxa"/>
+            <w:tcW w:w="6763" w:type="dxa"/>
           </w:tcPr>
           <w:p>
             <w:pPr>
               <w:bidi w:val="0"/>
-              <w:spacing w:line="360" w:lineRule="auto"/>
-              <w:rPr>
-                <w:rFonts w:ascii="Calibri" w:hAnsi="Calibri" w:cs="Calibri"/>
-              </w:rPr>
-            </w:pPr>
+              <w:rPr>
+                <w:rFonts w:asciiTheme="minorBidi" w:hAnsiTheme="minorBidi" w:cstheme="minorBidi"/>
+              </w:rPr>
+            </w:pPr>
+            <w:r>
+              <w:rPr>
+                <w:rFonts w:asciiTheme="minorBidi" w:hAnsiTheme="minorBidi" w:cstheme="minorBidi"/>
+                <w:u w:val="single"/>
+              </w:rPr>
+              <w:t>clientID</w:t>
+            </w:r>
+            <w:r>
+              <w:rPr>
+                <w:rFonts w:asciiTheme="minorBidi" w:hAnsiTheme="minorBidi" w:cstheme="minorBidi"/>
+              </w:rPr>
+              <w:t>, firstName, lastName, phoneNum, isClubMem, memberSince</w:t>
+            </w:r>
           </w:p>
         </w:tc>
         <w:tc>
           <w:tcPr>
-            <w:tcW w:w="1553" w:type="dxa"/>
+            <w:tcW w:w="1844" w:type="dxa"/>
           </w:tcPr>
           <w:p>
             <w:pPr>
               <w:bidi w:val="0"/>
-              <w:spacing w:line="360" w:lineRule="auto"/>
-              <w:rPr>
-                <w:rFonts w:ascii="Calibri" w:hAnsi="Calibri" w:cs="Calibri"/>
-              </w:rPr>
-            </w:pPr>
+              <w:rPr>
+                <w:rFonts w:asciiTheme="minorBidi" w:hAnsiTheme="minorBidi" w:cstheme="minorBidi"/>
+              </w:rPr>
+            </w:pPr>
+            <w:r>
+              <w:rPr>
+                <w:rFonts w:asciiTheme="minorBidi" w:hAnsiTheme="minorBidi" w:cstheme="minorBidi"/>
+              </w:rPr>
+              <w:t>Clients</w:t>
+            </w:r>
           </w:p>
         </w:tc>
       </w:tr>
@@ -1780,30 +1937,79 @@
         </w:trPr>
         <w:tc>
           <w:tcPr>
-            <w:tcW w:w="6743" w:type="dxa"/>
+            <w:tcW w:w="6763" w:type="dxa"/>
           </w:tcPr>
           <w:p>
             <w:pPr>
               <w:bidi w:val="0"/>
-              <w:spacing w:line="360" w:lineRule="auto"/>
-              <w:rPr>
-                <w:rFonts w:ascii="Calibri" w:hAnsi="Calibri" w:cs="Calibri"/>
-              </w:rPr>
-            </w:pPr>
+              <w:rPr>
+                <w:rFonts w:asciiTheme="minorBidi" w:hAnsiTheme="minorBidi" w:cstheme="minorBidi"/>
+              </w:rPr>
+            </w:pPr>
+            <w:r>
+              <w:rPr>
+                <w:rFonts w:asciiTheme="minorBidi" w:hAnsiTheme="minorBidi" w:cstheme="minorBidi"/>
+                <w:u w:val="single"/>
+              </w:rPr>
+              <w:t>licensePlate</w:t>
+            </w:r>
+            <w:r>
+              <w:rPr>
+                <w:rFonts w:asciiTheme="minorBidi" w:hAnsiTheme="minorBidi" w:cstheme="minorBidi"/>
+              </w:rPr>
+              <w:t xml:space="preserve">, </w:t>
+            </w:r>
+            <w:r>
+              <w:rPr>
+                <w:rFonts w:asciiTheme="minorBidi" w:hAnsiTheme="minorBidi" w:cstheme="minorBidi"/>
+                <w:u w:val="single"/>
+              </w:rPr>
+              <w:t>clientID</w:t>
+            </w:r>
+            <w:r>
+              <w:rPr>
+                <w:rFonts w:asciiTheme="minorBidi" w:hAnsiTheme="minorBidi" w:cstheme="minorBidi"/>
+                <w:u w:val="single"/>
+              </w:rPr>
+              <w:t>(FK clients)</w:t>
+            </w:r>
+            <w:r>
+              <w:rPr>
+                <w:rFonts w:asciiTheme="minorBidi" w:hAnsiTheme="minorBidi" w:cstheme="minorBidi"/>
+              </w:rPr>
+              <w:t>, type, color</w:t>
+            </w:r>
+            <w:r>
+              <w:rPr>
+                <w:rFonts w:asciiTheme="minorBidi" w:hAnsiTheme="minorBidi" w:cstheme="minorBidi"/>
+              </w:rPr>
+              <w:t>, size, weight</w:t>
+            </w:r>
+            <w:r>
+              <w:rPr>
+                <w:rFonts w:asciiTheme="minorBidi" w:hAnsiTheme="minorBidi" w:cstheme="minorBidi"/>
+              </w:rPr>
+              <w:t xml:space="preserve">  </w:t>
+            </w:r>
           </w:p>
         </w:tc>
         <w:tc>
           <w:tcPr>
-            <w:tcW w:w="1553" w:type="dxa"/>
+            <w:tcW w:w="1844" w:type="dxa"/>
           </w:tcPr>
           <w:p>
             <w:pPr>
               <w:bidi w:val="0"/>
-              <w:spacing w:line="360" w:lineRule="auto"/>
-              <w:rPr>
-                <w:rFonts w:ascii="Calibri" w:hAnsi="Calibri" w:cs="Calibri"/>
-              </w:rPr>
-            </w:pPr>
+              <w:rPr>
+                <w:rFonts w:asciiTheme="minorBidi" w:hAnsiTheme="minorBidi" w:cstheme="minorBidi"/>
+              </w:rPr>
+            </w:pPr>
+            <w:r>
+              <w:rPr>
+                <w:rFonts w:asciiTheme="minorBidi" w:hAnsiTheme="minorBidi" w:cstheme="minorBidi"/>
+              </w:rPr>
+              <w:t>Vehicles</w:t>
+            </w:r>
           </w:p>
         </w:tc>
       </w:tr>
@@ -1814,30 +2020,88 @@
         </w:trPr>
         <w:tc>
           <w:tcPr>
-            <w:tcW w:w="6743" w:type="dxa"/>
+            <w:tcW w:w="6763" w:type="dxa"/>
           </w:tcPr>
           <w:p>
             <w:pPr>
               <w:bidi w:val="0"/>
-              <w:spacing w:line="360" w:lineRule="auto"/>
-              <w:rPr>
-                <w:rFonts w:ascii="Calibri" w:hAnsi="Calibri" w:cs="Calibri"/>
-              </w:rPr>
-            </w:pPr>
+              <w:rPr>
+                <w:rFonts w:asciiTheme="minorBidi" w:hAnsiTheme="minorBidi" w:cstheme="minorBidi"/>
+              </w:rPr>
+            </w:pPr>
+            <w:r>
+              <w:rPr>
+                <w:rFonts w:asciiTheme="minorBidi" w:hAnsiTheme="minorBidi" w:cstheme="minorBidi"/>
+                <w:u w:val="single"/>
+              </w:rPr>
+              <w:t>spaceID</w:t>
+            </w:r>
+            <w:r>
+              <w:rPr>
+                <w:rFonts w:asciiTheme="minorBidi" w:hAnsiTheme="minorBidi" w:cstheme="minorBidi"/>
+              </w:rPr>
+              <w:t xml:space="preserve">, </w:t>
+            </w:r>
+            <w:r>
+              <w:rPr>
+                <w:rFonts w:asciiTheme="minorBidi" w:hAnsiTheme="minorBidi" w:cstheme="minorBidi"/>
+              </w:rPr>
+              <w:t>ParkinglotID</w:t>
+            </w:r>
+            <w:r>
+              <w:rPr>
+                <w:rFonts w:asciiTheme="minorBidi" w:hAnsiTheme="minorBidi" w:cstheme="minorBidi"/>
+              </w:rPr>
+              <w:t xml:space="preserve"> (FK parkingLots), floor, </w:t>
+            </w:r>
+            <w:r>
+              <w:rPr>
+                <w:rFonts w:asciiTheme="minorBidi" w:hAnsiTheme="minorBidi" w:cstheme="minorBidi"/>
+              </w:rPr>
+              <w:t>coordinateX</w:t>
+            </w:r>
+            <w:bookmarkStart w:id="0" w:name="_GoBack"/>
+            <w:bookmarkEnd w:id="0"/>
+            <w:r>
+              <w:rPr>
+                <w:rFonts w:asciiTheme="minorBidi" w:hAnsiTheme="minorBidi" w:cstheme="minorBidi"/>
+              </w:rPr>
+              <w:t>,</w:t>
+            </w:r>
+            <w:r>
+              <w:t xml:space="preserve"> </w:t>
+            </w:r>
+            <w:r>
+              <w:rPr>
+                <w:rFonts w:asciiTheme="minorBidi" w:hAnsiTheme="minorBidi" w:cstheme="minorBidi"/>
+              </w:rPr>
+              <w:t>coordinateY</w:t>
+            </w:r>
+            <w:r>
+              <w:rPr>
+                <w:rFonts w:asciiTheme="minorBidi" w:hAnsiTheme="minorBidi" w:cstheme="minorBidi"/>
+              </w:rPr>
+              <w:t xml:space="preserve">, size </w:t>
+            </w:r>
           </w:p>
         </w:tc>
         <w:tc>
           <w:tcPr>
-            <w:tcW w:w="1553" w:type="dxa"/>
+            <w:tcW w:w="1844" w:type="dxa"/>
           </w:tcPr>
           <w:p>
             <w:pPr>
               <w:bidi w:val="0"/>
-              <w:spacing w:line="360" w:lineRule="auto"/>
-              <w:rPr>
-                <w:rFonts w:ascii="Calibri" w:hAnsi="Calibri" w:cs="Calibri"/>
-              </w:rPr>
-            </w:pPr>
+              <w:rPr>
+                <w:rFonts w:asciiTheme="minorBidi" w:hAnsiTheme="minorBidi" w:cstheme="minorBidi"/>
+              </w:rPr>
+            </w:pPr>
+            <w:r>
+              <w:rPr>
+                <w:rFonts w:asciiTheme="minorBidi" w:hAnsiTheme="minorBidi" w:cstheme="minorBidi"/>
+              </w:rPr>
+              <w:t>ParkingSpaces</w:t>
+            </w:r>
           </w:p>
         </w:tc>
       </w:tr>
@@ -1848,30 +2112,85 @@
         </w:trPr>
         <w:tc>
           <w:tcPr>
-            <w:tcW w:w="6743" w:type="dxa"/>
+            <w:tcW w:w="6763" w:type="dxa"/>
           </w:tcPr>
           <w:p>
             <w:pPr>
               <w:bidi w:val="0"/>
-              <w:spacing w:line="360" w:lineRule="auto"/>
-              <w:rPr>
-                <w:rFonts w:ascii="Calibri" w:hAnsi="Calibri" w:cs="Calibri"/>
-              </w:rPr>
-            </w:pPr>
+              <w:rPr>
+                <w:rFonts w:asciiTheme="minorBidi" w:hAnsiTheme="minorBidi" w:cstheme="minorBidi"/>
+              </w:rPr>
+            </w:pPr>
+            <w:r>
+              <w:rPr>
+                <w:rFonts w:asciiTheme="minorBidi" w:hAnsiTheme="minorBidi" w:cstheme="minorBidi"/>
+                <w:u w:val="single"/>
+              </w:rPr>
+              <w:t>conveyerID</w:t>
+            </w:r>
+            <w:r>
+              <w:rPr>
+                <w:rFonts w:asciiTheme="minorBidi" w:hAnsiTheme="minorBidi" w:cstheme="minorBidi"/>
+              </w:rPr>
+              <w:t>, maxWeight</w:t>
+            </w:r>
+            <w:r>
+              <w:rPr>
+                <w:rFonts w:asciiTheme="minorBidi" w:hAnsiTheme="minorBidi" w:cstheme="minorBidi"/>
+              </w:rPr>
+              <w:t xml:space="preserve">, </w:t>
+            </w:r>
+            <w:r>
+              <w:rPr>
+                <w:rFonts w:asciiTheme="minorBidi" w:hAnsiTheme="minorBidi" w:cstheme="minorBidi"/>
+                <w:u w:val="single"/>
+              </w:rPr>
+              <w:t>ParkinglotID</w:t>
+            </w:r>
+            <w:r>
+              <w:rPr>
+                <w:rFonts w:asciiTheme="minorBidi" w:hAnsiTheme="minorBidi" w:cstheme="minorBidi"/>
+                <w:u w:val="single"/>
+              </w:rPr>
+              <w:t xml:space="preserve"> </w:t>
+            </w:r>
+            <w:r>
+              <w:rPr>
+                <w:rFonts w:asciiTheme="minorBidi" w:hAnsiTheme="minorBidi" w:cstheme="minorBidi"/>
+              </w:rPr>
+              <w:t>(</w:t>
+            </w:r>
+            <w:r>
+              <w:rPr>
+                <w:rFonts w:asciiTheme="minorBidi" w:hAnsiTheme="minorBidi" w:cstheme="minorBidi"/>
+              </w:rPr>
+              <w:t>FK parkingLots</w:t>
+            </w:r>
+            <w:r>
+              <w:rPr>
+                <w:rFonts w:asciiTheme="minorBidi" w:hAnsiTheme="minorBidi" w:cstheme="minorBidi"/>
+              </w:rPr>
+              <w:t>)</w:t>
+            </w:r>
           </w:p>
         </w:tc>
         <w:tc>
           <w:tcPr>
-            <w:tcW w:w="1553" w:type="dxa"/>
+            <w:tcW w:w="1844" w:type="dxa"/>
           </w:tcPr>
           <w:p>
             <w:pPr>
               <w:bidi w:val="0"/>
-              <w:spacing w:line="360" w:lineRule="auto"/>
-              <w:rPr>
-                <w:rFonts w:ascii="Calibri" w:hAnsi="Calibri" w:cs="Calibri"/>
-              </w:rPr>
-            </w:pPr>
+              <w:rPr>
+                <w:rFonts w:asciiTheme="minorBidi" w:hAnsiTheme="minorBidi" w:cstheme="minorBidi"/>
+              </w:rPr>
+            </w:pPr>
+            <w:r>
+              <w:rPr>
+                <w:rFonts w:asciiTheme="minorBidi" w:hAnsiTheme="minorBidi" w:cstheme="minorBidi"/>
+              </w:rPr>
+              <w:t>Conveyers</w:t>
+            </w:r>
           </w:p>
         </w:tc>
       </w:tr>
@@ -1882,30 +2201,84 @@
         </w:trPr>
         <w:tc>
           <w:tcPr>
-            <w:tcW w:w="6743" w:type="dxa"/>
+            <w:tcW w:w="6763" w:type="dxa"/>
           </w:tcPr>
           <w:p>
             <w:pPr>
               <w:bidi w:val="0"/>
-              <w:spacing w:line="360" w:lineRule="auto"/>
-              <w:rPr>
-                <w:rFonts w:ascii="Calibri" w:hAnsi="Calibri" w:cs="Calibri"/>
-              </w:rPr>
-            </w:pPr>
+              <w:rPr>
+                <w:rFonts w:asciiTheme="minorBidi" w:hAnsiTheme="minorBidi" w:cstheme="minorBidi"/>
+              </w:rPr>
+            </w:pPr>
+            <w:r>
+              <w:rPr>
+                <w:rFonts w:asciiTheme="minorBidi" w:hAnsiTheme="minorBidi" w:cstheme="minorBidi"/>
+                <w:u w:val="single"/>
+              </w:rPr>
+              <w:t>listID</w:t>
+            </w:r>
+            <w:r>
+              <w:rPr>
+                <w:rFonts w:asciiTheme="minorBidi" w:hAnsiTheme="minorBidi" w:cstheme="minorBidi"/>
+                <w:u w:val="single"/>
+              </w:rPr>
+              <w:t xml:space="preserve">, </w:t>
+            </w:r>
+            <w:r>
+              <w:rPr>
+                <w:rFonts w:asciiTheme="minorBidi" w:hAnsiTheme="minorBidi" w:cstheme="minorBidi"/>
+              </w:rPr>
+              <w:t>yearAssociated</w:t>
+            </w:r>
+            <w:r>
+              <w:rPr>
+                <w:rFonts w:asciiTheme="minorBidi" w:hAnsiTheme="minorBidi" w:cstheme="minorBidi"/>
+              </w:rPr>
+              <w:t>, firstHour, additional</w:t>
+            </w:r>
+            <w:r>
+              <w:rPr>
+                <w:rFonts w:asciiTheme="minorBidi" w:hAnsiTheme="minorBidi" w:cstheme="minorBidi"/>
+              </w:rPr>
+              <w:t>Hour</w:t>
+            </w:r>
+            <w:r>
+              <w:rPr>
+                <w:rFonts w:asciiTheme="minorBidi" w:hAnsiTheme="minorBidi" w:cstheme="minorBidi"/>
+              </w:rPr>
+              <w:t>, extra</w:t>
+            </w:r>
+            <w:r>
+              <w:rPr>
+                <w:rFonts w:asciiTheme="minorBidi" w:hAnsiTheme="minorBidi" w:cstheme="minorBidi"/>
+              </w:rPr>
+              <w:t>Hour</w:t>
+            </w:r>
+            <w:r>
+              <w:rPr>
+                <w:rFonts w:asciiTheme="minorBidi" w:hAnsiTheme="minorBidi" w:cstheme="minorBidi"/>
+              </w:rPr>
+              <w:t>, fullDay</w:t>
+            </w:r>
           </w:p>
         </w:tc>
         <w:tc>
           <w:tcPr>
-            <w:tcW w:w="1553" w:type="dxa"/>
+            <w:tcW w:w="1844" w:type="dxa"/>
           </w:tcPr>
           <w:p>
             <w:pPr>
               <w:bidi w:val="0"/>
-              <w:spacing w:line="360" w:lineRule="auto"/>
-              <w:rPr>
-                <w:rFonts w:ascii="Calibri" w:hAnsi="Calibri" w:cs="Calibri"/>
-              </w:rPr>
-            </w:pPr>
+              <w:rPr>
+                <w:rFonts w:asciiTheme="minorBidi" w:hAnsiTheme="minorBidi" w:cstheme="minorBidi"/>
+              </w:rPr>
+            </w:pPr>
+            <w:r>
+              <w:rPr>
+                <w:rFonts w:asciiTheme="minorBidi" w:hAnsiTheme="minorBidi" w:cstheme="minorBidi"/>
+              </w:rPr>
+              <w:t>PriceList</w:t>
+            </w:r>
           </w:p>
         </w:tc>
       </w:tr>
@@ -1916,30 +2289,80 @@
         </w:trPr>
         <w:tc>
           <w:tcPr>
-            <w:tcW w:w="6743" w:type="dxa"/>
+            <w:tcW w:w="6763" w:type="dxa"/>
           </w:tcPr>
           <w:p>
             <w:pPr>
               <w:bidi w:val="0"/>
-              <w:spacing w:line="360" w:lineRule="auto"/>
-              <w:rPr>
-                <w:rFonts w:ascii="Calibri" w:hAnsi="Calibri" w:cs="Calibri"/>
-              </w:rPr>
-            </w:pPr>
+              <w:rPr>
+                <w:rFonts w:asciiTheme="minorBidi" w:hAnsiTheme="minorBidi" w:cstheme="minorBidi"/>
+              </w:rPr>
+            </w:pPr>
+            <w:r>
+              <w:rPr>
+                <w:rFonts w:asciiTheme="minorBidi" w:hAnsiTheme="minorBidi" w:cstheme="minorBidi"/>
+                <w:u w:val="single"/>
+              </w:rPr>
+              <w:t>historyID</w:t>
+            </w:r>
+            <w:r>
+              <w:rPr>
+                <w:rFonts w:asciiTheme="minorBidi" w:hAnsiTheme="minorBidi" w:cstheme="minorBidi"/>
+                <w:u w:val="single"/>
+              </w:rPr>
+              <w:t xml:space="preserve">, </w:t>
+            </w:r>
+            <w:r>
+              <w:rPr>
+                <w:rFonts w:asciiTheme="minorBidi" w:hAnsiTheme="minorBidi" w:cstheme="minorBidi"/>
+                <w:u w:val="single"/>
+              </w:rPr>
+              <w:t>ParkinglotID</w:t>
+            </w:r>
+            <w:r>
+              <w:rPr>
+                <w:rFonts w:asciiTheme="minorBidi" w:hAnsiTheme="minorBidi" w:cstheme="minorBidi"/>
+              </w:rPr>
+              <w:t xml:space="preserve">(FK parkingLot), </w:t>
+            </w:r>
+            <w:r>
+              <w:rPr>
+                <w:rFonts w:asciiTheme="minorBidi" w:hAnsiTheme="minorBidi" w:cstheme="minorBidi"/>
+                <w:u w:val="single"/>
+              </w:rPr>
+              <w:t>priceListID</w:t>
+            </w:r>
+            <w:r>
+              <w:rPr>
+                <w:rFonts w:asciiTheme="minorBidi" w:hAnsiTheme="minorBidi" w:cstheme="minorBidi"/>
+              </w:rPr>
+              <w:t>(FK from priceList)</w:t>
+            </w:r>
+            <w:r>
+              <w:rPr>
+                <w:rFonts w:asciiTheme="minorBidi" w:hAnsiTheme="minorBidi" w:cstheme="minorBidi"/>
+              </w:rPr>
+              <w:t>, assignedDate</w:t>
+            </w:r>
           </w:p>
         </w:tc>
         <w:tc>
           <w:tcPr>
-            <w:tcW w:w="1553" w:type="dxa"/>
+            <w:tcW w:w="1844" w:type="dxa"/>
           </w:tcPr>
           <w:p>
             <w:pPr>
               <w:bidi w:val="0"/>
-              <w:spacing w:line="360" w:lineRule="auto"/>
-              <w:rPr>
-                <w:rFonts w:ascii="Calibri" w:hAnsi="Calibri" w:cs="Calibri"/>
-              </w:rPr>
-            </w:pPr>
+              <w:rPr>
+                <w:rFonts w:asciiTheme="minorBidi" w:hAnsiTheme="minorBidi" w:cstheme="minorBidi"/>
+              </w:rPr>
+            </w:pPr>
+            <w:r>
+              <w:rPr>
+                <w:rFonts w:asciiTheme="minorBidi" w:hAnsiTheme="minorBidi" w:cstheme="minorBidi"/>
+              </w:rPr>
+              <w:t>LotPriceHistory</w:t>
+            </w:r>
           </w:p>
         </w:tc>
       </w:tr>
@@ -1950,30 +2373,99 @@
         </w:trPr>
         <w:tc>
           <w:tcPr>
-            <w:tcW w:w="6743" w:type="dxa"/>
+            <w:tcW w:w="6763" w:type="dxa"/>
           </w:tcPr>
           <w:p>
             <w:pPr>
               <w:bidi w:val="0"/>
-              <w:spacing w:line="360" w:lineRule="auto"/>
-              <w:rPr>
-                <w:rFonts w:ascii="Calibri" w:hAnsi="Calibri" w:cs="Calibri"/>
-              </w:rPr>
-            </w:pPr>
+              <w:rPr>
+                <w:rFonts w:asciiTheme="minorBidi" w:hAnsiTheme="minorBidi" w:cstheme="minorBidi"/>
+              </w:rPr>
+            </w:pPr>
+            <w:r>
+              <w:rPr>
+                <w:rFonts w:asciiTheme="minorBidi" w:hAnsiTheme="minorBidi" w:cstheme="minorBidi"/>
+                <w:u w:val="single"/>
+              </w:rPr>
+              <w:t>SessionID</w:t>
+            </w:r>
+            <w:r>
+              <w:rPr>
+                <w:rFonts w:asciiTheme="minorBidi" w:hAnsiTheme="minorBidi" w:cstheme="minorBidi"/>
+              </w:rPr>
+              <w:t xml:space="preserve"> (PK), </w:t>
+            </w:r>
+            <w:r>
+              <w:rPr>
+                <w:rFonts w:asciiTheme="minorBidi" w:hAnsiTheme="minorBidi" w:cstheme="minorBidi"/>
+                <w:u w:val="single"/>
+              </w:rPr>
+              <w:t>licensePlate</w:t>
+            </w:r>
+            <w:r>
+              <w:rPr>
+                <w:rFonts w:asciiTheme="minorBidi" w:hAnsiTheme="minorBidi" w:cstheme="minorBidi"/>
+              </w:rPr>
+              <w:t xml:space="preserve"> (FK), </w:t>
+            </w:r>
+            <w:r>
+              <w:rPr>
+                <w:rFonts w:asciiTheme="minorBidi" w:hAnsiTheme="minorBidi" w:cstheme="minorBidi"/>
+                <w:u w:val="single"/>
+              </w:rPr>
+              <w:t>ParkinglotID</w:t>
+            </w:r>
+            <w:r>
+              <w:rPr>
+                <w:rFonts w:asciiTheme="minorBidi" w:hAnsiTheme="minorBidi" w:cstheme="minorBidi"/>
+              </w:rPr>
+              <w:t xml:space="preserve"> (FK),</w:t>
+            </w:r>
+            <w:r>
+              <w:rPr>
+                <w:rFonts w:asciiTheme="minorBidi" w:hAnsiTheme="minorBidi" w:cstheme="minorBidi"/>
+                <w:u w:val="single"/>
+              </w:rPr>
+              <w:t>PriceListID</w:t>
+            </w:r>
+            <w:r>
+              <w:rPr>
+                <w:rFonts w:asciiTheme="minorBidi" w:hAnsiTheme="minorBidi" w:cstheme="minorBidi"/>
+              </w:rPr>
+              <w:t xml:space="preserve"> (FK), </w:t>
+            </w:r>
+            <w:r>
+              <w:rPr>
+                <w:rFonts w:asciiTheme="minorBidi" w:hAnsiTheme="minorBidi" w:cstheme="minorBidi"/>
+                <w:u w:val="single"/>
+              </w:rPr>
+              <w:t>SpaceID</w:t>
+            </w:r>
+            <w:r>
+              <w:rPr>
+                <w:rFonts w:asciiTheme="minorBidi" w:hAnsiTheme="minorBidi" w:cstheme="minorBidi"/>
+              </w:rPr>
+              <w:t xml:space="preserve"> (FK), EntryTime, ExitTime, TotalAmount</w:t>
+            </w:r>
           </w:p>
         </w:tc>
         <w:tc>
           <w:tcPr>
-            <w:tcW w:w="1553" w:type="dxa"/>
+            <w:tcW w:w="1844" w:type="dxa"/>
           </w:tcPr>
           <w:p>
             <w:pPr>
               <w:bidi w:val="0"/>
-              <w:spacing w:line="360" w:lineRule="auto"/>
-              <w:rPr>
-                <w:rFonts w:ascii="Calibri" w:hAnsi="Calibri" w:cs="Calibri"/>
-              </w:rPr>
-            </w:pPr>
+              <w:rPr>
+                <w:rFonts w:asciiTheme="minorBidi" w:hAnsiTheme="minorBidi" w:cstheme="minorBidi"/>
+              </w:rPr>
+            </w:pPr>
+            <w:r>
+              <w:rPr>
+                <w:rFonts w:asciiTheme="minorBidi" w:hAnsiTheme="minorBidi" w:cstheme="minorBidi"/>
+              </w:rPr>
+              <w:t>ParkingSessions</w:t>
+            </w:r>
           </w:p>
         </w:tc>
       </w:tr>
@@ -1984,98 +2476,52 @@
         </w:trPr>
         <w:tc>
           <w:tcPr>
-            <w:tcW w:w="6743" w:type="dxa"/>
+            <w:tcW w:w="6763" w:type="dxa"/>
           </w:tcPr>
           <w:p>
             <w:pPr>
               <w:bidi w:val="0"/>
-              <w:spacing w:line="360" w:lineRule="auto"/>
-              <w:rPr>
-                <w:rFonts w:ascii="Calibri" w:hAnsi="Calibri" w:cs="Calibri"/>
-              </w:rPr>
-            </w:pPr>
+              <w:rPr>
+                <w:rFonts w:asciiTheme="minorBidi" w:hAnsiTheme="minorBidi" w:cstheme="minorBidi"/>
+              </w:rPr>
+            </w:pPr>
+            <w:r>
+              <w:rPr>
+                <w:rFonts w:asciiTheme="minorBidi" w:hAnsiTheme="minorBidi" w:cstheme="minorBidi"/>
+              </w:rPr>
+              <w:t xml:space="preserve">ClientID (FK), </w:t>
+            </w:r>
+            <w:r>
+              <w:rPr>
+                <w:rFonts w:asciiTheme="minorBidi" w:hAnsiTheme="minorBidi" w:cstheme="minorBidi"/>
+              </w:rPr>
+              <w:t>ParkinglotID</w:t>
+            </w:r>
+            <w:r>
+              <w:rPr>
+                <w:rFonts w:asciiTheme="minorBidi" w:hAnsiTheme="minorBidi" w:cstheme="minorBidi"/>
+              </w:rPr>
+              <w:t xml:space="preserve"> (FK), SelectionDate</w:t>
+            </w:r>
           </w:p>
         </w:tc>
         <w:tc>
           <w:tcPr>
-            <w:tcW w:w="1553" w:type="dxa"/>
+            <w:tcW w:w="1844" w:type="dxa"/>
           </w:tcPr>
           <w:p>
             <w:pPr>
               <w:bidi w:val="0"/>
-              <w:spacing w:line="360" w:lineRule="auto"/>
-              <w:rPr>
-                <w:rFonts w:ascii="Calibri" w:hAnsi="Calibri" w:cs="Calibri"/>
-              </w:rPr>
-            </w:pPr>
-          </w:p>
-        </w:tc>
-      </w:tr>
-      <w:tr>
-        <w:trPr>
-          <w:trHeight w:val="851"/>
-          <w:jc w:val="right"/>
-        </w:trPr>
-        <w:tc>
-          <w:tcPr>
-            <w:tcW w:w="6743" w:type="dxa"/>
-          </w:tcPr>
-          <w:p>
-            <w:pPr>
-              <w:bidi w:val="0"/>
-              <w:spacing w:line="360" w:lineRule="auto"/>
-              <w:rPr>
-                <w:rFonts w:ascii="Calibri" w:hAnsi="Calibri" w:cs="Calibri"/>
-              </w:rPr>
-            </w:pPr>
-          </w:p>
-        </w:tc>
-        <w:tc>
-          <w:tcPr>
-            <w:tcW w:w="1553" w:type="dxa"/>
-          </w:tcPr>
-          <w:p>
-            <w:pPr>
-              <w:bidi w:val="0"/>
-              <w:spacing w:line="360" w:lineRule="auto"/>
-              <w:rPr>
-                <w:rFonts w:ascii="Calibri" w:hAnsi="Calibri" w:cs="Calibri"/>
-              </w:rPr>
-            </w:pPr>
-          </w:p>
-        </w:tc>
-      </w:tr>
-      <w:tr>
-        <w:trPr>
-          <w:trHeight w:val="851"/>
-          <w:jc w:val="right"/>
-        </w:trPr>
-        <w:tc>
-          <w:tcPr>
-            <w:tcW w:w="6743" w:type="dxa"/>
-          </w:tcPr>
-          <w:p>
-            <w:pPr>
-              <w:bidi w:val="0"/>
-              <w:spacing w:line="360" w:lineRule="auto"/>
-              <w:rPr>
-                <w:rFonts w:ascii="Calibri" w:hAnsi="Calibri" w:cs="Calibri"/>
-              </w:rPr>
-            </w:pPr>
-          </w:p>
-        </w:tc>
-        <w:tc>
-          <w:tcPr>
-            <w:tcW w:w="1553" w:type="dxa"/>
-          </w:tcPr>
-          <w:p>
-            <w:pPr>
-              <w:bidi w:val="0"/>
-              <w:spacing w:line="360" w:lineRule="auto"/>
-              <w:rPr>
-                <w:rFonts w:ascii="Calibri" w:hAnsi="Calibri" w:cs="Calibri"/>
-              </w:rPr>
-            </w:pPr>
+              <w:rPr>
+                <w:rFonts w:asciiTheme="minorBidi" w:hAnsiTheme="minorBidi" w:cstheme="minorBidi"/>
+              </w:rPr>
+            </w:pPr>
+            <w:r>
+              <w:rPr>
+                <w:rFonts w:asciiTheme="minorBidi" w:hAnsiTheme="minorBidi" w:cstheme="minorBidi"/>
+              </w:rPr>
+              <w:t>ClientPreferredLots</w:t>
+            </w:r>
           </w:p>
         </w:tc>
       </w:tr>
@@ -2083,84 +2529,132 @@
     <w:p>
       <w:pPr>
         <w:bidi w:val="0"/>
-        <w:spacing w:line="360" w:lineRule="auto"/>
-        <w:rPr>
-          <w:rFonts w:ascii="Calibri" w:hAnsi="Calibri" w:cs="Calibri"/>
+        <w:rPr>
+          <w:rFonts w:asciiTheme="minorBidi" w:hAnsiTheme="minorBidi" w:cstheme="minorBidi"/>
         </w:rPr>
       </w:pPr>
     </w:p>
     <w:p>
       <w:pPr>
-        <w:pStyle w:val="2"/>
-      </w:pPr>
-      <w:r>
-        <w:lastRenderedPageBreak/>
-        <w:t>1.1</w:t>
-      </w:r>
-      <w:proofErr w:type="gramStart"/>
-      <w:r>
-        <w:t>.d2</w:t>
-      </w:r>
-      <w:proofErr w:type="gramEnd"/>
-      <w:r>
-        <w:t xml:space="preserve">. </w:t>
-      </w:r>
-      <w:r>
-        <w:t xml:space="preserve">The Mutual </w:t>
-      </w:r>
-      <w:r>
-        <w:t>Relationships:</w:t>
+        <w:rPr>
+          <w:rFonts w:asciiTheme="minorBidi" w:hAnsiTheme="minorBidi" w:cstheme="minorBidi"/>
+          <w:b/>
+          <w:bCs/>
+          <w:sz w:val="28"/>
+          <w:szCs w:val="28"/>
+        </w:rPr>
+      </w:pPr>
+      <w:r>
+        <w:rPr>
+          <w:rFonts w:asciiTheme="minorBidi" w:hAnsiTheme="minorBidi" w:cstheme="minorBidi"/>
+        </w:rPr>
+        <w:br w:type="page"/>
       </w:r>
     </w:p>
     <w:p>
       <w:pPr>
-        <w:pBdr>
-          <w:top w:val="single" w:sz="4" w:space="1" w:color="auto"/>
-          <w:left w:val="single" w:sz="4" w:space="4" w:color="auto"/>
-          <w:bottom w:val="single" w:sz="4" w:space="1" w:color="auto"/>
-          <w:right w:val="single" w:sz="4" w:space="4" w:color="auto"/>
-        </w:pBdr>
-        <w:bidi w:val="0"/>
-        <w:rPr>
-          <w:rFonts w:ascii="Calibri" w:eastAsia="Arial" w:hAnsi="Calibri" w:cs="Calibri"/>
-        </w:rPr>
-      </w:pPr>
-      <w:r>
-        <w:rPr>
-          <w:rFonts w:ascii="Calibri" w:eastAsia="Arial" w:hAnsi="Calibri" w:cs="Calibri"/>
-        </w:rPr>
-        <w:t>Verify the readability and completeness of the s</w:t>
-      </w:r>
-      <w:r>
-        <w:rPr>
-          <w:rFonts w:ascii="Calibri" w:eastAsia="Arial" w:hAnsi="Calibri" w:cs="Calibri"/>
-        </w:rPr>
-        <w:t xml:space="preserve">creenshot </w:t>
-      </w:r>
-      <w:r>
-        <w:rPr>
-          <w:rFonts w:ascii="Calibri" w:eastAsia="Arial" w:hAnsi="Calibri" w:cs="Calibri"/>
-        </w:rPr>
-        <w:t xml:space="preserve">taken </w:t>
-      </w:r>
-      <w:r>
-        <w:rPr>
-          <w:rFonts w:ascii="Calibri" w:eastAsia="Arial" w:hAnsi="Calibri" w:cs="Calibri"/>
-        </w:rPr>
-        <w:t xml:space="preserve">from Microsoft access. </w:t>
+        <w:pStyle w:val="2"/>
+        <w:rPr>
+          <w:rFonts w:asciiTheme="minorBidi" w:hAnsiTheme="minorBidi" w:cstheme="minorBidi"/>
+        </w:rPr>
+      </w:pPr>
+      <w:r>
+        <w:rPr>
+          <w:rFonts w:asciiTheme="minorBidi" w:hAnsiTheme="minorBidi" w:cstheme="minorBidi"/>
+        </w:rPr>
+        <w:lastRenderedPageBreak/>
+        <w:t xml:space="preserve">1.1.d2. </w:t>
+      </w:r>
+      <w:r>
+        <w:rPr>
+          <w:rFonts w:asciiTheme="minorBidi" w:hAnsiTheme="minorBidi" w:cstheme="minorBidi"/>
+        </w:rPr>
+        <w:t xml:space="preserve">The Mutual </w:t>
+      </w:r>
+      <w:r>
+        <w:rPr>
+          <w:rFonts w:asciiTheme="minorBidi" w:hAnsiTheme="minorBidi" w:cstheme="minorBidi"/>
+        </w:rPr>
+        <w:t>Relationships:</w:t>
       </w:r>
     </w:p>
     <w:p>
       <w:pPr>
         <w:bidi w:val="0"/>
         <w:rPr>
-          <w:rFonts w:ascii="Calibri" w:eastAsia="Arial" w:hAnsi="Calibri" w:cs="Calibri"/>
+          <w:rFonts w:asciiTheme="minorBidi" w:eastAsia="Arial" w:hAnsiTheme="minorBidi" w:cstheme="minorBidi"/>
           <w:rtl/>
         </w:rPr>
       </w:pPr>
       <w:r>
         <w:rPr>
-          <w:rFonts w:ascii="Calibri" w:hAnsi="Calibri" w:cs="Calibri"/>
+          <w:rFonts w:asciiTheme="minorBidi" w:hAnsiTheme="minorBidi" w:cstheme="minorBidi"/>
+        </w:rPr>
+        <w:drawing>
+          <wp:anchor distT="0" distB="0" distL="114300" distR="114300" simplePos="0" relativeHeight="251660288" behindDoc="0" locked="0" layoutInCell="1" allowOverlap="1" wp14:anchorId="3DEAACB7" wp14:editId="513F074E">
+            <wp:simplePos x="0" y="0"/>
+            <wp:positionH relativeFrom="column">
+              <wp:posOffset>-1010285</wp:posOffset>
+            </wp:positionH>
+            <wp:positionV relativeFrom="paragraph">
+              <wp:posOffset>43180</wp:posOffset>
+            </wp:positionV>
+            <wp:extent cx="7324725" cy="3710305"/>
+            <wp:effectExtent l="0" t="0" r="9525" b="4445"/>
+            <wp:wrapSquare wrapText="bothSides"/>
+            <wp:docPr id="7" name="תמונה 7"/>
+            <wp:cNvGraphicFramePr>
+              <a:graphicFrameLocks xmlns:a="http://schemas.openxmlformats.org/drawingml/2006/main" noChangeAspect="1"/>
+            </wp:cNvGraphicFramePr>
+            <a:graphic xmlns:a="http://schemas.openxmlformats.org/drawingml/2006/main">
+              <a:graphicData uri="http://schemas.openxmlformats.org/drawingml/2006/picture">
+                <pic:pic xmlns:pic="http://schemas.openxmlformats.org/drawingml/2006/picture">
+                  <pic:nvPicPr>
+                    <pic:cNvPr id="0" name=""/>
+                    <pic:cNvPicPr/>
+                  </pic:nvPicPr>
+                  <pic:blipFill>
+                    <a:blip r:embed="rId15">
+                      <a:extLst>
+                        <a:ext uri="{28A0092B-C50C-407E-A947-70E740481C1C}">
+                          <a14:useLocalDpi xmlns:a14="http://schemas.microsoft.com/office/drawing/2010/main" val="0"/>
+                        </a:ext>
+                      </a:extLst>
+                    </a:blip>
+                    <a:stretch>
+                      <a:fillRect/>
+                    </a:stretch>
+                  </pic:blipFill>
+                  <pic:spPr>
+                    <a:xfrm>
+                      <a:off x="0" y="0"/>
+                      <a:ext cx="7324725" cy="3710305"/>
+                    </a:xfrm>
+                    <a:prstGeom prst="rect">
+                      <a:avLst/>
+                    </a:prstGeom>
+                  </pic:spPr>
+                </pic:pic>
+              </a:graphicData>
+            </a:graphic>
+            <wp14:sizeRelH relativeFrom="page">
+              <wp14:pctWidth>0</wp14:pctWidth>
+            </wp14:sizeRelH>
+            <wp14:sizeRelV relativeFrom="page">
+              <wp14:pctHeight>0</wp14:pctHeight>
+            </wp14:sizeRelV>
+          </wp:anchor>
+        </w:drawing>
+      </w:r>
+      <w:r>
+        <w:rPr>
+          <w:rFonts w:asciiTheme="minorBidi" w:hAnsiTheme="minorBidi" w:cstheme="minorBidi"/>
+        </w:rPr>
+        <w:t xml:space="preserve"> </w:t>
+      </w:r>
+      <w:r>
+        <w:rPr>
+          <w:rFonts w:asciiTheme="minorBidi" w:hAnsiTheme="minorBidi" w:cstheme="minorBidi"/>
         </w:rPr>
         <w:br w:type="page"/>
       </w:r>
@@ -2169,119 +2663,124 @@
       <w:pPr>
         <w:pStyle w:val="1"/>
         <w:bidi w:val="0"/>
-        <w:spacing w:line="360" w:lineRule="auto"/>
-        <w:rPr>
-          <w:rFonts w:ascii="Calibri" w:hAnsi="Calibri" w:cs="Calibri"/>
+        <w:rPr>
+          <w:rFonts w:asciiTheme="minorBidi" w:hAnsiTheme="minorBidi" w:cstheme="minorBidi"/>
           <w:rtl/>
         </w:rPr>
       </w:pPr>
       <w:r>
         <w:rPr>
-          <w:rFonts w:ascii="Calibri" w:hAnsi="Calibri" w:cs="Calibri"/>
+          <w:rFonts w:asciiTheme="minorBidi" w:hAnsiTheme="minorBidi" w:cstheme="minorBidi"/>
         </w:rPr>
         <w:lastRenderedPageBreak/>
-        <w:t>1.1</w:t>
-      </w:r>
-      <w:proofErr w:type="gramStart"/>
-      <w:r>
-        <w:rPr>
-          <w:rFonts w:ascii="Calibri" w:hAnsi="Calibri" w:cs="Calibri"/>
-        </w:rPr>
-        <w:t>.</w:t>
-      </w:r>
-      <w:r>
-        <w:rPr>
-          <w:rFonts w:ascii="Calibri" w:hAnsi="Calibri" w:cs="Calibri"/>
-        </w:rPr>
-        <w:t>e</w:t>
-      </w:r>
-      <w:proofErr w:type="gramEnd"/>
-      <w:r>
-        <w:rPr>
-          <w:rFonts w:ascii="Calibri" w:hAnsi="Calibri" w:cs="Calibri"/>
-        </w:rPr>
-        <w:t xml:space="preserve">. The </w:t>
-      </w:r>
-      <w:r>
-        <w:rPr>
-          <w:rFonts w:ascii="Calibri" w:hAnsi="Calibri" w:cs="Calibri"/>
+        <w:t>1.1.</w:t>
+      </w:r>
+      <w:r>
+        <w:rPr>
+          <w:rFonts w:asciiTheme="minorBidi" w:hAnsiTheme="minorBidi" w:cstheme="minorBidi"/>
+        </w:rPr>
+        <w:t xml:space="preserve">e. The </w:t>
+      </w:r>
+      <w:r>
+        <w:rPr>
+          <w:rFonts w:asciiTheme="minorBidi" w:hAnsiTheme="minorBidi" w:cstheme="minorBidi"/>
         </w:rPr>
         <w:t>QBE</w:t>
       </w:r>
       <w:r>
         <w:rPr>
-          <w:rFonts w:ascii="Calibri" w:hAnsi="Calibri" w:cs="Calibri"/>
+          <w:rFonts w:asciiTheme="minorBidi" w:hAnsiTheme="minorBidi" w:cstheme="minorBidi"/>
         </w:rPr>
         <w:t xml:space="preserve"> Query</w:t>
       </w:r>
       <w:r>
         <w:rPr>
-          <w:rFonts w:ascii="Calibri" w:hAnsi="Calibri" w:cs="Calibri"/>
+          <w:rFonts w:asciiTheme="minorBidi" w:hAnsiTheme="minorBidi" w:cstheme="minorBidi"/>
         </w:rPr>
         <w:t>:</w:t>
       </w:r>
     </w:p>
     <w:p>
       <w:pPr>
-        <w:pBdr>
-          <w:top w:val="single" w:sz="4" w:space="1" w:color="auto"/>
-          <w:left w:val="single" w:sz="4" w:space="4" w:color="auto"/>
-          <w:bottom w:val="single" w:sz="4" w:space="1" w:color="auto"/>
-          <w:right w:val="single" w:sz="4" w:space="4" w:color="auto"/>
-        </w:pBdr>
         <w:bidi w:val="0"/>
         <w:rPr>
-          <w:rFonts w:ascii="Calibri" w:eastAsia="Arial" w:hAnsi="Calibri" w:cs="Calibri"/>
-        </w:rPr>
-      </w:pPr>
-      <w:r>
-        <w:rPr>
-          <w:rFonts w:ascii="Calibri" w:eastAsia="Arial" w:hAnsi="Calibri" w:cs="Calibri"/>
-        </w:rPr>
-        <w:t>Verify the readability and completeness of the s</w:t>
-      </w:r>
-      <w:r>
-        <w:rPr>
-          <w:rFonts w:ascii="Calibri" w:eastAsia="Arial" w:hAnsi="Calibri" w:cs="Calibri"/>
-        </w:rPr>
-        <w:t xml:space="preserve">creenshot </w:t>
-      </w:r>
-      <w:r>
-        <w:rPr>
-          <w:rFonts w:ascii="Calibri" w:eastAsia="Arial" w:hAnsi="Calibri" w:cs="Calibri"/>
-        </w:rPr>
-        <w:t xml:space="preserve">taken </w:t>
-      </w:r>
-      <w:r>
-        <w:rPr>
-          <w:rFonts w:ascii="Calibri" w:eastAsia="Arial" w:hAnsi="Calibri" w:cs="Calibri"/>
-        </w:rPr>
-        <w:t xml:space="preserve">from Microsoft access. </w:t>
+          <w:rFonts w:asciiTheme="minorBidi" w:eastAsia="Arial" w:hAnsiTheme="minorBidi" w:cstheme="minorBidi"/>
+        </w:rPr>
+      </w:pPr>
+      <w:r>
+        <w:rPr>
+          <w:rFonts w:asciiTheme="minorBidi" w:hAnsiTheme="minorBidi" w:cstheme="minorBidi"/>
+        </w:rPr>
+        <w:drawing>
+          <wp:anchor distT="0" distB="0" distL="114300" distR="114300" simplePos="0" relativeHeight="251661312" behindDoc="0" locked="0" layoutInCell="1" allowOverlap="1" wp14:anchorId="32A88794" wp14:editId="024206A0">
+            <wp:simplePos x="0" y="0"/>
+            <wp:positionH relativeFrom="column">
+              <wp:posOffset>-295275</wp:posOffset>
+            </wp:positionH>
+            <wp:positionV relativeFrom="paragraph">
+              <wp:posOffset>260985</wp:posOffset>
+            </wp:positionV>
+            <wp:extent cx="5939155" cy="3876675"/>
+            <wp:effectExtent l="0" t="0" r="4445" b="9525"/>
+            <wp:wrapSquare wrapText="bothSides"/>
+            <wp:docPr id="6" name="תמונה 6"/>
+            <wp:cNvGraphicFramePr>
+              <a:graphicFrameLocks xmlns:a="http://schemas.openxmlformats.org/drawingml/2006/main" noChangeAspect="1"/>
+            </wp:cNvGraphicFramePr>
+            <a:graphic xmlns:a="http://schemas.openxmlformats.org/drawingml/2006/main">
+              <a:graphicData uri="http://schemas.openxmlformats.org/drawingml/2006/picture">
+                <pic:pic xmlns:pic="http://schemas.openxmlformats.org/drawingml/2006/picture">
+                  <pic:nvPicPr>
+                    <pic:cNvPr id="0" name=""/>
+                    <pic:cNvPicPr/>
+                  </pic:nvPicPr>
+                  <pic:blipFill>
+                    <a:blip r:embed="rId16">
+                      <a:extLst>
+                        <a:ext uri="{28A0092B-C50C-407E-A947-70E740481C1C}">
+                          <a14:useLocalDpi xmlns:a14="http://schemas.microsoft.com/office/drawing/2010/main" val="0"/>
+                        </a:ext>
+                      </a:extLst>
+                    </a:blip>
+                    <a:stretch>
+                      <a:fillRect/>
+                    </a:stretch>
+                  </pic:blipFill>
+                  <pic:spPr>
+                    <a:xfrm>
+                      <a:off x="0" y="0"/>
+                      <a:ext cx="5939155" cy="3876675"/>
+                    </a:xfrm>
+                    <a:prstGeom prst="rect">
+                      <a:avLst/>
+                    </a:prstGeom>
+                  </pic:spPr>
+                </pic:pic>
+              </a:graphicData>
+            </a:graphic>
+            <wp14:sizeRelH relativeFrom="page">
+              <wp14:pctWidth>0</wp14:pctWidth>
+            </wp14:sizeRelH>
+            <wp14:sizeRelV relativeFrom="page">
+              <wp14:pctHeight>0</wp14:pctHeight>
+            </wp14:sizeRelV>
+          </wp:anchor>
+        </w:drawing>
       </w:r>
     </w:p>
     <w:p>
       <w:pPr>
         <w:bidi w:val="0"/>
         <w:rPr>
-          <w:rFonts w:ascii="Calibri" w:eastAsia="Arial" w:hAnsi="Calibri" w:cs="Calibri"/>
-        </w:rPr>
-      </w:pPr>
-    </w:p>
-    <w:p>
-      <w:pPr>
-        <w:bidi w:val="0"/>
-        <w:spacing w:line="360" w:lineRule="auto"/>
-        <w:jc w:val="both"/>
-        <w:rPr>
-          <w:rFonts w:ascii="Calibri" w:hAnsi="Calibri" w:cs="Calibri"/>
+          <w:rFonts w:asciiTheme="minorBidi" w:hAnsiTheme="minorBidi" w:cstheme="minorBidi"/>
         </w:rPr>
       </w:pPr>
       <w:bookmarkStart w:id="1" w:name="_heading=h.gjdgxs" w:colFirst="0" w:colLast="0"/>
       <w:bookmarkEnd w:id="1"/>
     </w:p>
     <w:sectPr>
-      <w:footerReference w:type="even" r:id="rId13"/>
-      <w:footerReference w:type="default" r:id="rId14"/>
+      <w:footerReference w:type="even" r:id="rId17"/>
+      <w:footerReference w:type="default" r:id="rId18"/>
       <w:pgSz w:w="11906" w:h="16838"/>
       <w:pgMar w:top="1440" w:right="1800" w:bottom="1440" w:left="1800" w:header="708" w:footer="708" w:gutter="0"/>
       <w:pgNumType w:start="1"/>
@@ -2414,7 +2913,7 @@
         <w:color w:val="000000"/>
         <w:rtl/>
       </w:rPr>
-      <w:t>4</w:t>
+      <w:t>6</w:t>
     </w:r>
     <w:r>
       <w:rPr>
@@ -2579,6 +3078,92 @@
     </w:lvl>
   </w:abstractNum>
   <w:abstractNum w:abstractNumId="1">
+    <w:nsid w:val="61E71F9B"/>
+    <w:multiLevelType w:val="hybridMultilevel"/>
+    <w:tmpl w:val="8170050E"/>
+    <w:lvl w:ilvl="0" w:tplc="0409000F">
+      <w:start w:val="1"/>
+      <w:numFmt w:val="decimal"/>
+      <w:lvlText w:val="%1."/>
+      <w:lvlJc w:val="left"/>
+      <w:pPr>
+        <w:ind w:left="720" w:hanging="360"/>
+      </w:pPr>
+    </w:lvl>
+    <w:lvl w:ilvl="1" w:tplc="04090019" w:tentative="1">
+      <w:start w:val="1"/>
+      <w:numFmt w:val="lowerLetter"/>
+      <w:lvlText w:val="%2."/>
+      <w:lvlJc w:val="left"/>
+      <w:pPr>
+        <w:ind w:left="1440" w:hanging="360"/>
+      </w:pPr>
+    </w:lvl>
+    <w:lvl w:ilvl="2" w:tplc="0409001B" w:tentative="1">
+      <w:start w:val="1"/>
+      <w:numFmt w:val="lowerRoman"/>
+      <w:lvlText w:val="%3."/>
+      <w:lvlJc w:val="right"/>
+      <w:pPr>
+        <w:ind w:left="2160" w:hanging="180"/>
+      </w:pPr>
+    </w:lvl>
+    <w:lvl w:ilvl="3" w:tplc="0409000F" w:tentative="1">
+      <w:start w:val="1"/>
+      <w:numFmt w:val="decimal"/>
+      <w:lvlText w:val="%4."/>
+      <w:lvlJc w:val="left"/>
+      <w:pPr>
+        <w:ind w:left="2880" w:hanging="360"/>
+      </w:pPr>
+    </w:lvl>
+    <w:lvl w:ilvl="4" w:tplc="04090019" w:tentative="1">
+      <w:start w:val="1"/>
+      <w:numFmt w:val="lowerLetter"/>
+      <w:lvlText w:val="%5."/>
+      <w:lvlJc w:val="left"/>
+      <w:pPr>
+        <w:ind w:left="3600" w:hanging="360"/>
+      </w:pPr>
+    </w:lvl>
+    <w:lvl w:ilvl="5" w:tplc="0409001B" w:tentative="1">
+      <w:start w:val="1"/>
+      <w:numFmt w:val="lowerRoman"/>
+      <w:lvlText w:val="%6."/>
+      <w:lvlJc w:val="right"/>
+      <w:pPr>
+        <w:ind w:left="4320" w:hanging="180"/>
+      </w:pPr>
+    </w:lvl>
+    <w:lvl w:ilvl="6" w:tplc="0409000F" w:tentative="1">
+      <w:start w:val="1"/>
+      <w:numFmt w:val="decimal"/>
+      <w:lvlText w:val="%7."/>
+      <w:lvlJc w:val="left"/>
+      <w:pPr>
+        <w:ind w:left="5040" w:hanging="360"/>
+      </w:pPr>
+    </w:lvl>
+    <w:lvl w:ilvl="7" w:tplc="04090019" w:tentative="1">
+      <w:start w:val="1"/>
+      <w:numFmt w:val="lowerLetter"/>
+      <w:lvlText w:val="%8."/>
+      <w:lvlJc w:val="left"/>
+      <w:pPr>
+        <w:ind w:left="5760" w:hanging="360"/>
+      </w:pPr>
+    </w:lvl>
+    <w:lvl w:ilvl="8" w:tplc="0409001B" w:tentative="1">
+      <w:start w:val="1"/>
+      <w:numFmt w:val="lowerRoman"/>
+      <w:lvlText w:val="%9."/>
+      <w:lvlJc w:val="right"/>
+      <w:pPr>
+        <w:ind w:left="6480" w:hanging="180"/>
+      </w:pPr>
+    </w:lvl>
+  </w:abstractNum>
+  <w:abstractNum w:abstractNumId="2">
     <w:nsid w:val="789B3201"/>
     <w:multiLevelType w:val="hybridMultilevel"/>
     <w:tmpl w:val="3484207E"/>
@@ -2695,6 +3280,9 @@
     <w:abstractNumId w:val="0"/>
   </w:num>
   <w:num w:numId="2">
+    <w:abstractNumId w:val="2"/>
+  </w:num>
+  <w:num w:numId="3">
     <w:abstractNumId w:val="1"/>
   </w:num>
 </w:numbering>
@@ -3188,7 +3776,6 @@
     <w:basedOn w:val="a"/>
     <w:link w:val="HTML0"/>
     <w:uiPriority w:val="99"/>
-    <w:semiHidden/>
     <w:unhideWhenUsed/>
     <w:rsid w:val="00AE457A"/>
     <w:pPr>
@@ -3223,7 +3810,6 @@
     <w:basedOn w:val="a0"/>
     <w:link w:val="HTML"/>
     <w:uiPriority w:val="99"/>
-    <w:semiHidden/>
     <w:rsid w:val="00AE457A"/>
     <w:rPr>
       <w:rFonts w:ascii="Courier New" w:hAnsi="Courier New" w:cs="Courier New"/>
@@ -3759,7 +4345,6 @@
     <w:basedOn w:val="a"/>
     <w:link w:val="HTML0"/>
     <w:uiPriority w:val="99"/>
-    <w:semiHidden/>
     <w:unhideWhenUsed/>
     <w:rsid w:val="00AE457A"/>
     <w:pPr>
@@ -3794,7 +4379,6 @@
     <w:basedOn w:val="a0"/>
     <w:link w:val="HTML"/>
     <w:uiPriority w:val="99"/>
-    <w:semiHidden/>
     <w:rsid w:val="00AE457A"/>
     <w:rPr>
       <w:rFonts w:ascii="Courier New" w:hAnsi="Courier New" w:cs="Courier New"/>
@@ -4147,7 +4731,7 @@
 </file>
 
 <file path=customXml/itemProps2.xml><?xml version="1.0" encoding="utf-8"?>
-<ds:datastoreItem xmlns:ds="http://schemas.openxmlformats.org/officeDocument/2006/customXml" ds:itemID="{CB4E4C18-1B23-4D4D-8A4C-D00E173C82FB}">
+<ds:datastoreItem xmlns:ds="http://schemas.openxmlformats.org/officeDocument/2006/customXml" ds:itemID="{0CC343E4-55F4-4519-B635-7C094F1E575D}">
   <ds:schemaRefs>
     <ds:schemaRef ds:uri="http://schemas.openxmlformats.org/officeDocument/2006/bibliography"/>
   </ds:schemaRefs>

</xml_diff>